<commit_message>
adicionar texto exemplo, com indicativos de seção
</commit_message>
<xml_diff>
--- a/TemplateFund2Word.docx
+++ b/TemplateFund2Word.docx
@@ -2,7 +2,1147 @@
 <file path=word/document.xml><?xml version="1.0" encoding="utf-8"?>
 <w:document xmlns:wpc="http://schemas.microsoft.com/office/word/2010/wordprocessingCanvas" xmlns:cx="http://schemas.microsoft.com/office/drawing/2014/chartex" xmlns:cx1="http://schemas.microsoft.com/office/drawing/2015/9/8/chartex" xmlns:cx2="http://schemas.microsoft.com/office/drawing/2015/10/21/chartex" xmlns:cx3="http://schemas.microsoft.com/office/drawing/2016/5/9/chartex" xmlns:cx4="http://schemas.microsoft.com/office/drawing/2016/5/10/chartex" xmlns:cx5="http://schemas.microsoft.com/office/drawing/2016/5/11/chartex" xmlns:cx6="http://schemas.microsoft.com/office/drawing/2016/5/12/chartex" xmlns:cx7="http://schemas.microsoft.com/office/drawing/2016/5/13/chartex" xmlns:cx8="http://schemas.microsoft.com/office/drawing/2016/5/14/chartex" xmlns:mc="http://schemas.openxmlformats.org/markup-compatibility/2006" xmlns:aink="http://schemas.microsoft.com/office/drawing/2016/ink" xmlns:am3d="http://schemas.microsoft.com/office/drawing/2017/model3d" xmlns:o="urn:schemas-microsoft-com:office:office" xmlns:oel="http://schemas.microsoft.com/office/2019/extlst" xmlns:r="http://schemas.openxmlformats.org/officeDocument/2006/relationships" xmlns:m="http://schemas.openxmlformats.org/officeDocument/2006/math" xmlns:v="urn:schemas-microsoft-com:vml" xmlns:wp14="http://schemas.microsoft.com/office/word/2010/wordprocessingDrawing" xmlns:wp="http://schemas.openxmlformats.org/drawingml/2006/wordprocessingDrawing" xmlns:w10="urn:schemas-microsoft-com:office:word" xmlns:w="http://schemas.openxmlformats.org/wordprocessingml/2006/main" xmlns:w14="http://schemas.microsoft.com/office/word/2010/wordml" xmlns:w15="http://schemas.microsoft.com/office/word/2012/wordml" xmlns:w16cex="http://schemas.microsoft.com/office/word/2018/wordml/cex" xmlns:w16cid="http://schemas.microsoft.com/office/word/2016/wordml/cid" xmlns:w16="http://schemas.microsoft.com/office/word/2018/wordml" xmlns:w16du="http://schemas.microsoft.com/office/word/2023/wordml/word16du" xmlns:w16sdtdh="http://schemas.microsoft.com/office/word/2020/wordml/sdtdatahash" xmlns:w16sdtfl="http://schemas.microsoft.com/office/word/2024/wordml/sdtformatlock" xmlns:w16se="http://schemas.microsoft.com/office/word/2015/wordml/symex" xmlns:wpg="http://schemas.microsoft.com/office/word/2010/wordprocessingGroup" xmlns:wpi="http://schemas.microsoft.com/office/word/2010/wordprocessingInk" xmlns:wne="http://schemas.microsoft.com/office/word/2006/wordml" xmlns:wps="http://schemas.microsoft.com/office/word/2010/wordprocessingShape" mc:Ignorable="w14 w15 w16se w16cid w16 w16cex w16sdtdh w16sdtfl w16du wp14">
   <w:body>
-    <w:p/>
+    <w:p>
+      <w:pPr>
+        <w:jc w:val="center"/>
+      </w:pPr>
+      <w:r>
+        <w:t>NOME DA ESCOLA</w:t>
+      </w:r>
+    </w:p>
+    <w:p>
+      <w:pPr>
+        <w:jc w:val="center"/>
+      </w:pPr>
+    </w:p>
+    <w:p>
+      <w:pPr>
+        <w:jc w:val="center"/>
+      </w:pPr>
+    </w:p>
+    <w:p>
+      <w:pPr>
+        <w:jc w:val="center"/>
+      </w:pPr>
+    </w:p>
+    <w:p>
+      <w:pPr>
+        <w:jc w:val="center"/>
+      </w:pPr>
+      <w:r>
+        <w:t>NOME DO ALUNO</w:t>
+      </w:r>
+    </w:p>
+    <w:p>
+      <w:pPr>
+        <w:jc w:val="center"/>
+      </w:pPr>
+      <w:r>
+        <w:t>NOME DO ALUNO 2</w:t>
+      </w:r>
+      <w:r>
+        <w:t xml:space="preserve"> (coloque linha vazia aqui se não há)</w:t>
+      </w:r>
+    </w:p>
+    <w:p>
+      <w:pPr>
+        <w:jc w:val="center"/>
+      </w:pPr>
+      <w:r>
+        <w:t>NOME DO ALUNO 3 (coloque linha vazia aqui se não há)</w:t>
+      </w:r>
+    </w:p>
+    <w:p>
+      <w:pPr>
+        <w:jc w:val="center"/>
+      </w:pPr>
+    </w:p>
+    <w:p>
+      <w:pPr>
+        <w:jc w:val="center"/>
+      </w:pPr>
+    </w:p>
+    <w:p>
+      <w:pPr>
+        <w:jc w:val="center"/>
+      </w:pPr>
+    </w:p>
+    <w:p>
+      <w:pPr>
+        <w:jc w:val="center"/>
+      </w:pPr>
+    </w:p>
+    <w:p>
+      <w:pPr>
+        <w:jc w:val="center"/>
+      </w:pPr>
+    </w:p>
+    <w:p>
+      <w:pPr>
+        <w:jc w:val="center"/>
+      </w:pPr>
+    </w:p>
+    <w:p>
+      <w:pPr>
+        <w:jc w:val="center"/>
+      </w:pPr>
+    </w:p>
+    <w:p>
+      <w:pPr>
+        <w:jc w:val="center"/>
+      </w:pPr>
+    </w:p>
+    <w:p>
+      <w:pPr>
+        <w:jc w:val="center"/>
+      </w:pPr>
+    </w:p>
+    <w:p>
+      <w:pPr>
+        <w:jc w:val="center"/>
+      </w:pPr>
+      <w:r>
+        <w:t>TÍTULO DO TRABALHO:</w:t>
+      </w:r>
+    </w:p>
+    <w:p>
+      <w:pPr>
+        <w:jc w:val="center"/>
+      </w:pPr>
+      <w:r>
+        <w:t>Subtítulo do trabalho</w:t>
+      </w:r>
+    </w:p>
+    <w:p>
+      <w:pPr>
+        <w:jc w:val="center"/>
+      </w:pPr>
+    </w:p>
+    <w:p>
+      <w:pPr>
+        <w:jc w:val="center"/>
+      </w:pPr>
+    </w:p>
+    <w:p>
+      <w:pPr>
+        <w:jc w:val="center"/>
+      </w:pPr>
+    </w:p>
+    <w:p>
+      <w:pPr>
+        <w:jc w:val="center"/>
+      </w:pPr>
+    </w:p>
+    <w:p>
+      <w:pPr>
+        <w:jc w:val="center"/>
+      </w:pPr>
+    </w:p>
+    <w:p>
+      <w:pPr>
+        <w:jc w:val="center"/>
+      </w:pPr>
+    </w:p>
+    <w:p>
+      <w:pPr>
+        <w:jc w:val="center"/>
+      </w:pPr>
+    </w:p>
+    <w:p>
+      <w:pPr>
+        <w:jc w:val="center"/>
+      </w:pPr>
+    </w:p>
+    <w:p>
+      <w:pPr>
+        <w:jc w:val="center"/>
+      </w:pPr>
+    </w:p>
+    <w:p>
+      <w:pPr>
+        <w:jc w:val="center"/>
+      </w:pPr>
+    </w:p>
+    <w:p>
+      <w:pPr>
+        <w:jc w:val="center"/>
+      </w:pPr>
+    </w:p>
+    <w:p>
+      <w:pPr>
+        <w:jc w:val="center"/>
+      </w:pPr>
+    </w:p>
+    <w:p>
+      <w:pPr>
+        <w:jc w:val="center"/>
+      </w:pPr>
+    </w:p>
+    <w:p>
+      <w:pPr>
+        <w:jc w:val="center"/>
+      </w:pPr>
+    </w:p>
+    <w:p>
+      <w:pPr>
+        <w:jc w:val="center"/>
+      </w:pPr>
+      <w:r>
+        <w:t>CIDADE</w:t>
+      </w:r>
+    </w:p>
+    <w:p>
+      <w:pPr>
+        <w:ind w:firstLine="708"/>
+        <w:jc w:val="center"/>
+      </w:pPr>
+      <w:r>
+        <w:t>2026</w:t>
+      </w:r>
+    </w:p>
+    <w:p>
+      <w:pPr>
+        <w:ind w:firstLine="708"/>
+      </w:pPr>
+    </w:p>
+    <w:p>
+      <w:pPr>
+        <w:pStyle w:val="Ttulo1"/>
+      </w:pPr>
+      <w:r>
+        <w:t>1. Introdução</w:t>
+      </w:r>
+    </w:p>
+    <w:p>
+      <w:r>
+        <w:t xml:space="preserve">Deve-se abordar claramente o assunto trabalhado, o objetivo, bem como </w:t>
+      </w:r>
+      <w:proofErr w:type="spellStart"/>
+      <w:r>
+        <w:t>fornecer</w:t>
+      </w:r>
+      <w:proofErr w:type="spellEnd"/>
+      <w:r>
+        <w:t xml:space="preserve"> alguns detalhes de como a pesquisa foi feita, entre outas. Pode-se também dar uma breve descrição sobre os </w:t>
+      </w:r>
+      <w:proofErr w:type="spellStart"/>
+      <w:r>
+        <w:t>tópcios</w:t>
+      </w:r>
+      <w:proofErr w:type="spellEnd"/>
+      <w:r>
+        <w:t xml:space="preserve"> e o contexto histórico. Não é correto colocar conclusões na introdução.</w:t>
+      </w:r>
+    </w:p>
+    <w:p>
+      <w:r>
+        <w:t xml:space="preserve">Não sei quantos níveis o sumário precisa, então, por favor, se você sabe, por favor, abra uma </w:t>
+      </w:r>
+      <w:proofErr w:type="spellStart"/>
+      <w:r>
+        <w:t>issue</w:t>
+      </w:r>
+      <w:proofErr w:type="spellEnd"/>
+      <w:r>
+        <w:t xml:space="preserve"> no repositório e explique, obrigado!</w:t>
+      </w:r>
+    </w:p>
+    <w:p>
+      <w:r>
+        <w:t xml:space="preserve">Também gostaria de notar que não sou responsável por qualquer 0, anulação, ou outros problemas decorridos de usar esse </w:t>
+      </w:r>
+      <w:proofErr w:type="spellStart"/>
+      <w:r>
+        <w:t>template</w:t>
+      </w:r>
+      <w:proofErr w:type="spellEnd"/>
+      <w:r>
+        <w:t xml:space="preserve"> para o trabalho!</w:t>
+      </w:r>
+    </w:p>
+    <w:p>
+      <w:pPr>
+        <w:pStyle w:val="Ttulo1"/>
+      </w:pPr>
+      <w:r>
+        <w:t>2. Desenvolvimento</w:t>
+      </w:r>
+    </w:p>
+    <w:p>
+      <w:r>
+        <w:t>Deve conter um texto claro e objetivo, abordando completamente o assunto, levantando problemas e soluções e também as argumentações do aluno. É importante que o texto não contenha erros de gramática e tenha coerência, ou seja, começo, meio e fim. Não deve haver cópia</w:t>
+      </w:r>
+    </w:p>
+    <w:p>
+      <w:r>
+        <w:t>Este documento demonstra todos os subníveis.</w:t>
+      </w:r>
+    </w:p>
+    <w:p>
+      <w:pPr>
+        <w:pStyle w:val="Ttulo2"/>
+      </w:pPr>
+      <w:r>
+        <w:t>2.1 Citações</w:t>
+      </w:r>
+    </w:p>
+    <w:p>
+      <w:r>
+        <w:t>Menção no texto, de uma informação extraída de outra fonte, segundo a ABNT BNR 10520 (2002, p.2), as citações “de até três linha devem estar identificadas com o uso de aspas duplas.”</w:t>
+      </w:r>
+    </w:p>
+    <w:p>
+      <w:proofErr w:type="spellStart"/>
+      <w:r>
+        <w:t>Ex</w:t>
+      </w:r>
+      <w:proofErr w:type="spellEnd"/>
+      <w:r>
+        <w:t>: “A matemática era, sem dúvida, a atividade favorita de Arquimedes.” (GOLDSMITH, 2011, p.9)</w:t>
+      </w:r>
+    </w:p>
+    <w:p>
+      <w:r>
+        <w:t xml:space="preserve">Citações com mais de três linhas devem estar recuadas a 4 cm da margem esquerda, com letra de tamanho menor, espaçamento simples e sem aspas. Este </w:t>
+      </w:r>
+      <w:proofErr w:type="spellStart"/>
+      <w:r>
+        <w:t>template</w:t>
+      </w:r>
+      <w:proofErr w:type="spellEnd"/>
+      <w:r>
+        <w:t xml:space="preserve"> </w:t>
+      </w:r>
+      <w:proofErr w:type="spellStart"/>
+      <w:r>
+        <w:t>ját</w:t>
+      </w:r>
+      <w:proofErr w:type="spellEnd"/>
+      <w:r>
+        <w:t xml:space="preserve"> e inclui o estilo “Citação mais de 4 linhas”, para esse fim. </w:t>
+      </w:r>
+      <w:proofErr w:type="spellStart"/>
+      <w:r>
+        <w:t>Ex</w:t>
+      </w:r>
+      <w:proofErr w:type="spellEnd"/>
+      <w:r>
+        <w:t>:</w:t>
+      </w:r>
+    </w:p>
+    <w:p>
+      <w:pPr>
+        <w:pStyle w:val="Citao"/>
+      </w:pPr>
+      <w:r>
+        <w:t>Arquimedes não é apenas um sujeito muito famoso, como também está muito morto, viveu há mais de 2 mil anos, uma época que ninguém se preocupava em inventar coisas (GOLDSMITH, 2011, p.10)</w:t>
+      </w:r>
+    </w:p>
+    <w:p>
+      <w:r>
+        <w:t xml:space="preserve">Provavelmente é necessário colocar algum espaçamento depois. </w:t>
+      </w:r>
+    </w:p>
+    <w:p>
+      <w:pPr>
+        <w:pStyle w:val="Ttulo2"/>
+      </w:pPr>
+      <w:r>
+        <w:lastRenderedPageBreak/>
+        <w:t>2.2 Seção secundária</w:t>
+      </w:r>
+    </w:p>
+    <w:p>
+      <w:proofErr w:type="spellStart"/>
+      <w:r>
+        <w:t>Lorem</w:t>
+      </w:r>
+      <w:proofErr w:type="spellEnd"/>
+      <w:r>
+        <w:t xml:space="preserve"> ipsum </w:t>
+      </w:r>
+      <w:proofErr w:type="spellStart"/>
+      <w:r>
+        <w:t>dolor</w:t>
+      </w:r>
+      <w:proofErr w:type="spellEnd"/>
+      <w:r>
+        <w:t xml:space="preserve"> </w:t>
+      </w:r>
+      <w:proofErr w:type="spellStart"/>
+      <w:r>
+        <w:t>sit</w:t>
+      </w:r>
+      <w:proofErr w:type="spellEnd"/>
+      <w:r>
+        <w:t xml:space="preserve"> </w:t>
+      </w:r>
+      <w:proofErr w:type="spellStart"/>
+      <w:r>
+        <w:t>amet</w:t>
+      </w:r>
+      <w:proofErr w:type="spellEnd"/>
+      <w:r>
+        <w:t xml:space="preserve">, </w:t>
+      </w:r>
+      <w:proofErr w:type="spellStart"/>
+      <w:r>
+        <w:t>consectetur</w:t>
+      </w:r>
+      <w:proofErr w:type="spellEnd"/>
+      <w:r>
+        <w:t xml:space="preserve"> </w:t>
+      </w:r>
+      <w:proofErr w:type="spellStart"/>
+      <w:r>
+        <w:t>adipiscing</w:t>
+      </w:r>
+      <w:proofErr w:type="spellEnd"/>
+      <w:r>
+        <w:t xml:space="preserve"> </w:t>
+      </w:r>
+      <w:proofErr w:type="spellStart"/>
+      <w:r>
+        <w:t>elit</w:t>
+      </w:r>
+      <w:proofErr w:type="spellEnd"/>
+      <w:r>
+        <w:t xml:space="preserve">. </w:t>
+      </w:r>
+      <w:r>
+        <w:rPr>
+          <w:lang w:val="en-US"/>
+        </w:rPr>
+        <w:t xml:space="preserve">Aenean </w:t>
+      </w:r>
+      <w:proofErr w:type="spellStart"/>
+      <w:r>
+        <w:rPr>
+          <w:lang w:val="en-US"/>
+        </w:rPr>
+        <w:t>tincidunt</w:t>
+      </w:r>
+      <w:proofErr w:type="spellEnd"/>
+      <w:r>
+        <w:rPr>
+          <w:lang w:val="en-US"/>
+        </w:rPr>
+        <w:t xml:space="preserve"> </w:t>
+      </w:r>
+      <w:proofErr w:type="spellStart"/>
+      <w:r>
+        <w:rPr>
+          <w:lang w:val="en-US"/>
+        </w:rPr>
+        <w:t>porttitor</w:t>
+      </w:r>
+      <w:proofErr w:type="spellEnd"/>
+      <w:r>
+        <w:rPr>
+          <w:lang w:val="en-US"/>
+        </w:rPr>
+        <w:t xml:space="preserve"> </w:t>
+      </w:r>
+      <w:proofErr w:type="spellStart"/>
+      <w:r>
+        <w:rPr>
+          <w:lang w:val="en-US"/>
+        </w:rPr>
+        <w:t>nisl</w:t>
+      </w:r>
+      <w:proofErr w:type="spellEnd"/>
+      <w:r>
+        <w:rPr>
+          <w:lang w:val="en-US"/>
+        </w:rPr>
+        <w:t xml:space="preserve">, </w:t>
+      </w:r>
+      <w:proofErr w:type="spellStart"/>
+      <w:r>
+        <w:rPr>
+          <w:lang w:val="en-US"/>
+        </w:rPr>
+        <w:t>finibus</w:t>
+      </w:r>
+      <w:proofErr w:type="spellEnd"/>
+      <w:r>
+        <w:rPr>
+          <w:lang w:val="en-US"/>
+        </w:rPr>
+        <w:t xml:space="preserve"> </w:t>
+      </w:r>
+      <w:proofErr w:type="spellStart"/>
+      <w:r>
+        <w:rPr>
+          <w:lang w:val="en-US"/>
+        </w:rPr>
+        <w:t>sagittis</w:t>
+      </w:r>
+      <w:proofErr w:type="spellEnd"/>
+      <w:r>
+        <w:rPr>
+          <w:lang w:val="en-US"/>
+        </w:rPr>
+        <w:t xml:space="preserve"> </w:t>
+      </w:r>
+      <w:proofErr w:type="spellStart"/>
+      <w:r>
+        <w:rPr>
+          <w:lang w:val="en-US"/>
+        </w:rPr>
+        <w:t>odio</w:t>
+      </w:r>
+      <w:proofErr w:type="spellEnd"/>
+      <w:r>
+        <w:rPr>
+          <w:lang w:val="en-US"/>
+        </w:rPr>
+        <w:t xml:space="preserve"> </w:t>
+      </w:r>
+      <w:proofErr w:type="spellStart"/>
+      <w:r>
+        <w:rPr>
+          <w:lang w:val="en-US"/>
+        </w:rPr>
+        <w:t>ullamcorper</w:t>
+      </w:r>
+      <w:proofErr w:type="spellEnd"/>
+      <w:r>
+        <w:rPr>
+          <w:lang w:val="en-US"/>
+        </w:rPr>
+        <w:t xml:space="preserve"> non. </w:t>
+      </w:r>
+      <w:proofErr w:type="spellStart"/>
+      <w:r>
+        <w:t>Sed</w:t>
+      </w:r>
+      <w:proofErr w:type="spellEnd"/>
+      <w:r>
+        <w:t xml:space="preserve"> </w:t>
+      </w:r>
+      <w:proofErr w:type="spellStart"/>
+      <w:r>
+        <w:t>euismod</w:t>
+      </w:r>
+      <w:proofErr w:type="spellEnd"/>
+      <w:r>
+        <w:t xml:space="preserve"> </w:t>
+      </w:r>
+      <w:proofErr w:type="spellStart"/>
+      <w:r>
+        <w:t>rutrum</w:t>
+      </w:r>
+      <w:proofErr w:type="spellEnd"/>
+      <w:r>
+        <w:t xml:space="preserve"> </w:t>
+      </w:r>
+      <w:proofErr w:type="spellStart"/>
+      <w:r>
+        <w:t>eros</w:t>
+      </w:r>
+      <w:proofErr w:type="spellEnd"/>
+      <w:r>
+        <w:t xml:space="preserve">, </w:t>
+      </w:r>
+      <w:proofErr w:type="spellStart"/>
+      <w:r>
+        <w:t>nec</w:t>
+      </w:r>
+      <w:proofErr w:type="spellEnd"/>
+      <w:r>
+        <w:t xml:space="preserve"> </w:t>
+      </w:r>
+      <w:proofErr w:type="spellStart"/>
+      <w:r>
+        <w:t>volutpat</w:t>
+      </w:r>
+      <w:proofErr w:type="spellEnd"/>
+      <w:r>
+        <w:t xml:space="preserve"> ante </w:t>
+      </w:r>
+      <w:proofErr w:type="spellStart"/>
+      <w:r>
+        <w:t>luctus</w:t>
+      </w:r>
+      <w:proofErr w:type="spellEnd"/>
+      <w:r>
+        <w:t xml:space="preserve"> a.</w:t>
+      </w:r>
+    </w:p>
+    <w:p>
+      <w:pPr>
+        <w:pStyle w:val="Ttulo3"/>
+      </w:pPr>
+      <w:r>
+        <w:t>2.2.1 Seção terciária</w:t>
+      </w:r>
+    </w:p>
+    <w:p>
+      <w:pPr>
+        <w:rPr>
+          <w:lang w:val="en-US"/>
+        </w:rPr>
+      </w:pPr>
+      <w:proofErr w:type="spellStart"/>
+      <w:r>
+        <w:rPr>
+          <w:lang w:val="en-US"/>
+        </w:rPr>
+        <w:t>Pellentesque</w:t>
+      </w:r>
+      <w:proofErr w:type="spellEnd"/>
+      <w:r>
+        <w:rPr>
+          <w:lang w:val="en-US"/>
+        </w:rPr>
+        <w:t xml:space="preserve"> </w:t>
+      </w:r>
+      <w:proofErr w:type="spellStart"/>
+      <w:r>
+        <w:rPr>
+          <w:lang w:val="en-US"/>
+        </w:rPr>
+        <w:t>elit</w:t>
+      </w:r>
+      <w:proofErr w:type="spellEnd"/>
+      <w:r>
+        <w:rPr>
+          <w:lang w:val="en-US"/>
+        </w:rPr>
+        <w:t xml:space="preserve"> </w:t>
+      </w:r>
+      <w:proofErr w:type="spellStart"/>
+      <w:r>
+        <w:rPr>
+          <w:lang w:val="en-US"/>
+        </w:rPr>
+        <w:t>sem</w:t>
+      </w:r>
+      <w:proofErr w:type="spellEnd"/>
+      <w:r>
+        <w:rPr>
+          <w:lang w:val="en-US"/>
+        </w:rPr>
+        <w:t xml:space="preserve">, </w:t>
+      </w:r>
+      <w:proofErr w:type="spellStart"/>
+      <w:r>
+        <w:rPr>
+          <w:lang w:val="en-US"/>
+        </w:rPr>
+        <w:t>aliquet</w:t>
+      </w:r>
+      <w:proofErr w:type="spellEnd"/>
+      <w:r>
+        <w:rPr>
+          <w:lang w:val="en-US"/>
+        </w:rPr>
+        <w:t xml:space="preserve"> sed </w:t>
+      </w:r>
+      <w:proofErr w:type="spellStart"/>
+      <w:r>
+        <w:rPr>
+          <w:lang w:val="en-US"/>
+        </w:rPr>
+        <w:t>efficitur</w:t>
+      </w:r>
+      <w:proofErr w:type="spellEnd"/>
+      <w:r>
+        <w:rPr>
+          <w:lang w:val="en-US"/>
+        </w:rPr>
+        <w:t xml:space="preserve"> sit </w:t>
+      </w:r>
+      <w:proofErr w:type="spellStart"/>
+      <w:r>
+        <w:rPr>
+          <w:lang w:val="en-US"/>
+        </w:rPr>
+        <w:t>amet</w:t>
+      </w:r>
+      <w:proofErr w:type="spellEnd"/>
+      <w:r>
+        <w:rPr>
+          <w:lang w:val="en-US"/>
+        </w:rPr>
+        <w:t xml:space="preserve">, </w:t>
+      </w:r>
+      <w:proofErr w:type="spellStart"/>
+      <w:r>
+        <w:rPr>
+          <w:lang w:val="en-US"/>
+        </w:rPr>
+        <w:t>efficitur</w:t>
+      </w:r>
+      <w:proofErr w:type="spellEnd"/>
+      <w:r>
+        <w:rPr>
+          <w:lang w:val="en-US"/>
+        </w:rPr>
+        <w:t xml:space="preserve"> in </w:t>
+      </w:r>
+      <w:proofErr w:type="spellStart"/>
+      <w:r>
+        <w:rPr>
+          <w:lang w:val="en-US"/>
+        </w:rPr>
+        <w:t>turpis</w:t>
+      </w:r>
+      <w:proofErr w:type="spellEnd"/>
+      <w:r>
+        <w:rPr>
+          <w:lang w:val="en-US"/>
+        </w:rPr>
+        <w:t xml:space="preserve">. Proin et </w:t>
+      </w:r>
+      <w:proofErr w:type="spellStart"/>
+      <w:r>
+        <w:rPr>
+          <w:lang w:val="en-US"/>
+        </w:rPr>
+        <w:t>risus</w:t>
+      </w:r>
+      <w:proofErr w:type="spellEnd"/>
+      <w:r>
+        <w:rPr>
+          <w:lang w:val="en-US"/>
+        </w:rPr>
+        <w:t xml:space="preserve"> </w:t>
+      </w:r>
+      <w:proofErr w:type="spellStart"/>
+      <w:r>
+        <w:rPr>
+          <w:lang w:val="en-US"/>
+        </w:rPr>
+        <w:t>felis</w:t>
+      </w:r>
+      <w:proofErr w:type="spellEnd"/>
+      <w:r>
+        <w:rPr>
+          <w:lang w:val="en-US"/>
+        </w:rPr>
+        <w:t xml:space="preserve">. Duis sit </w:t>
+      </w:r>
+      <w:proofErr w:type="spellStart"/>
+      <w:r>
+        <w:rPr>
+          <w:lang w:val="en-US"/>
+        </w:rPr>
+        <w:t>amet</w:t>
+      </w:r>
+      <w:proofErr w:type="spellEnd"/>
+      <w:r>
+        <w:rPr>
+          <w:lang w:val="en-US"/>
+        </w:rPr>
+        <w:t xml:space="preserve"> </w:t>
+      </w:r>
+      <w:proofErr w:type="spellStart"/>
+      <w:r>
+        <w:rPr>
+          <w:lang w:val="en-US"/>
+        </w:rPr>
+        <w:t>efficitur</w:t>
+      </w:r>
+      <w:proofErr w:type="spellEnd"/>
+      <w:r>
+        <w:rPr>
+          <w:lang w:val="en-US"/>
+        </w:rPr>
+        <w:t xml:space="preserve"> lorem, sed auctor </w:t>
+      </w:r>
+      <w:proofErr w:type="spellStart"/>
+      <w:r>
+        <w:rPr>
+          <w:lang w:val="en-US"/>
+        </w:rPr>
+        <w:t>orci</w:t>
+      </w:r>
+      <w:proofErr w:type="spellEnd"/>
+    </w:p>
+    <w:p>
+      <w:pPr>
+        <w:pStyle w:val="Ttulo4"/>
+      </w:pPr>
+      <w:r>
+        <w:t xml:space="preserve">2.2.1.1 Seção </w:t>
+      </w:r>
+      <w:proofErr w:type="spellStart"/>
+      <w:r>
+        <w:t>quartenária</w:t>
+      </w:r>
+      <w:proofErr w:type="spellEnd"/>
+    </w:p>
+    <w:p>
+      <w:proofErr w:type="spellStart"/>
+      <w:r>
+        <w:t>Pellentesque</w:t>
+      </w:r>
+      <w:proofErr w:type="spellEnd"/>
+      <w:r>
+        <w:t xml:space="preserve"> </w:t>
+      </w:r>
+      <w:proofErr w:type="spellStart"/>
+      <w:r>
+        <w:t>at</w:t>
+      </w:r>
+      <w:proofErr w:type="spellEnd"/>
+      <w:r>
+        <w:t xml:space="preserve"> est </w:t>
+      </w:r>
+      <w:proofErr w:type="spellStart"/>
+      <w:r>
+        <w:t>rutrum</w:t>
+      </w:r>
+      <w:proofErr w:type="spellEnd"/>
+      <w:r>
+        <w:t xml:space="preserve">, </w:t>
+      </w:r>
+      <w:proofErr w:type="spellStart"/>
+      <w:r>
+        <w:t>efficitur</w:t>
+      </w:r>
+      <w:proofErr w:type="spellEnd"/>
+      <w:r>
+        <w:t xml:space="preserve"> </w:t>
+      </w:r>
+      <w:proofErr w:type="spellStart"/>
+      <w:r>
+        <w:t>lacus</w:t>
+      </w:r>
+      <w:proofErr w:type="spellEnd"/>
+      <w:r>
+        <w:t xml:space="preserve"> ac, </w:t>
+      </w:r>
+      <w:proofErr w:type="spellStart"/>
+      <w:r>
+        <w:t>mollis</w:t>
+      </w:r>
+      <w:proofErr w:type="spellEnd"/>
+      <w:r>
+        <w:t xml:space="preserve"> </w:t>
+      </w:r>
+      <w:proofErr w:type="spellStart"/>
+      <w:r>
+        <w:t>sapien</w:t>
+      </w:r>
+      <w:proofErr w:type="spellEnd"/>
+      <w:r>
+        <w:t xml:space="preserve">. </w:t>
+      </w:r>
+      <w:proofErr w:type="spellStart"/>
+      <w:r>
+        <w:t>Aenean</w:t>
+      </w:r>
+      <w:proofErr w:type="spellEnd"/>
+      <w:r>
+        <w:t xml:space="preserve"> magna </w:t>
+      </w:r>
+      <w:proofErr w:type="spellStart"/>
+      <w:r>
+        <w:t>lorem</w:t>
+      </w:r>
+      <w:proofErr w:type="spellEnd"/>
+      <w:r>
+        <w:t xml:space="preserve">, </w:t>
+      </w:r>
+      <w:proofErr w:type="spellStart"/>
+      <w:r>
+        <w:t>mattis</w:t>
+      </w:r>
+      <w:proofErr w:type="spellEnd"/>
+      <w:r>
+        <w:t xml:space="preserve"> ac </w:t>
+      </w:r>
+      <w:proofErr w:type="spellStart"/>
+      <w:r>
+        <w:t>ligula</w:t>
+      </w:r>
+      <w:proofErr w:type="spellEnd"/>
+      <w:r>
+        <w:t xml:space="preserve"> et, </w:t>
+      </w:r>
+      <w:proofErr w:type="spellStart"/>
+      <w:r>
+        <w:t>auctor</w:t>
+      </w:r>
+      <w:proofErr w:type="spellEnd"/>
+      <w:r>
+        <w:t xml:space="preserve"> </w:t>
+      </w:r>
+      <w:proofErr w:type="spellStart"/>
+      <w:r>
+        <w:t>luctus</w:t>
+      </w:r>
+      <w:proofErr w:type="spellEnd"/>
+      <w:r>
+        <w:t xml:space="preserve"> ex. </w:t>
+      </w:r>
+    </w:p>
+    <w:p>
+      <w:pPr>
+        <w:pStyle w:val="Ttulo5"/>
+      </w:pPr>
+      <w:r>
+        <w:t>2.2.1.1.1 Seção quinária</w:t>
+      </w:r>
+    </w:p>
+    <w:p>
+      <w:r>
+        <w:tab/>
+      </w:r>
+      <w:proofErr w:type="spellStart"/>
+      <w:r>
+        <w:t>Vivamus</w:t>
+      </w:r>
+      <w:proofErr w:type="spellEnd"/>
+      <w:r>
+        <w:t xml:space="preserve"> vitae </w:t>
+      </w:r>
+      <w:proofErr w:type="spellStart"/>
+      <w:r>
+        <w:t>posuere</w:t>
+      </w:r>
+      <w:proofErr w:type="spellEnd"/>
+      <w:r>
+        <w:t xml:space="preserve"> </w:t>
+      </w:r>
+      <w:proofErr w:type="spellStart"/>
+      <w:r>
+        <w:t>nisl</w:t>
+      </w:r>
+      <w:proofErr w:type="spellEnd"/>
+      <w:r>
+        <w:t xml:space="preserve">, eu </w:t>
+      </w:r>
+      <w:proofErr w:type="spellStart"/>
+      <w:r>
+        <w:t>scelerisque</w:t>
+      </w:r>
+      <w:proofErr w:type="spellEnd"/>
+      <w:r>
+        <w:t xml:space="preserve"> </w:t>
+      </w:r>
+      <w:proofErr w:type="spellStart"/>
+      <w:r>
+        <w:t>dolor</w:t>
+      </w:r>
+      <w:proofErr w:type="spellEnd"/>
+      <w:r>
+        <w:t xml:space="preserve">. </w:t>
+      </w:r>
+      <w:r>
+        <w:rPr>
+          <w:lang w:val="en-US"/>
+        </w:rPr>
+        <w:t xml:space="preserve">Proin </w:t>
+      </w:r>
+      <w:proofErr w:type="spellStart"/>
+      <w:r>
+        <w:rPr>
+          <w:lang w:val="en-US"/>
+        </w:rPr>
+        <w:t>aliquam</w:t>
+      </w:r>
+      <w:proofErr w:type="spellEnd"/>
+      <w:r>
+        <w:rPr>
+          <w:lang w:val="en-US"/>
+        </w:rPr>
+        <w:t xml:space="preserve"> </w:t>
+      </w:r>
+      <w:proofErr w:type="spellStart"/>
+      <w:r>
+        <w:rPr>
+          <w:lang w:val="en-US"/>
+        </w:rPr>
+        <w:t>sollicitudin</w:t>
+      </w:r>
+      <w:proofErr w:type="spellEnd"/>
+      <w:r>
+        <w:rPr>
+          <w:lang w:val="en-US"/>
+        </w:rPr>
+        <w:t xml:space="preserve"> </w:t>
+      </w:r>
+      <w:proofErr w:type="spellStart"/>
+      <w:r>
+        <w:rPr>
+          <w:lang w:val="en-US"/>
+        </w:rPr>
+        <w:t>elit</w:t>
+      </w:r>
+      <w:proofErr w:type="spellEnd"/>
+      <w:r>
+        <w:rPr>
+          <w:lang w:val="en-US"/>
+        </w:rPr>
+        <w:t xml:space="preserve"> nec </w:t>
+      </w:r>
+      <w:proofErr w:type="spellStart"/>
+      <w:r>
+        <w:rPr>
+          <w:lang w:val="en-US"/>
+        </w:rPr>
+        <w:t>laoreet</w:t>
+      </w:r>
+      <w:proofErr w:type="spellEnd"/>
+      <w:r>
+        <w:rPr>
+          <w:lang w:val="en-US"/>
+        </w:rPr>
+        <w:t xml:space="preserve">. </w:t>
+      </w:r>
+      <w:proofErr w:type="spellStart"/>
+      <w:r>
+        <w:t>Nulla</w:t>
+      </w:r>
+      <w:proofErr w:type="spellEnd"/>
+      <w:r>
+        <w:t xml:space="preserve"> </w:t>
+      </w:r>
+      <w:proofErr w:type="spellStart"/>
+      <w:r>
+        <w:t>eget</w:t>
+      </w:r>
+      <w:proofErr w:type="spellEnd"/>
+      <w:r>
+        <w:t xml:space="preserve"> </w:t>
+      </w:r>
+      <w:proofErr w:type="spellStart"/>
+      <w:r>
+        <w:t>tincidunt</w:t>
+      </w:r>
+      <w:proofErr w:type="spellEnd"/>
+      <w:r>
+        <w:t xml:space="preserve"> </w:t>
+      </w:r>
+      <w:proofErr w:type="spellStart"/>
+      <w:r>
+        <w:t>eros</w:t>
+      </w:r>
+      <w:proofErr w:type="spellEnd"/>
+      <w:r>
+        <w:t xml:space="preserve">, </w:t>
+      </w:r>
+      <w:proofErr w:type="spellStart"/>
+      <w:r>
+        <w:t>eget</w:t>
+      </w:r>
+      <w:proofErr w:type="spellEnd"/>
+      <w:r>
+        <w:t xml:space="preserve"> </w:t>
+      </w:r>
+      <w:proofErr w:type="spellStart"/>
+      <w:r>
+        <w:t>efficitur</w:t>
+      </w:r>
+      <w:proofErr w:type="spellEnd"/>
+      <w:r>
+        <w:t xml:space="preserve"> </w:t>
+      </w:r>
+      <w:proofErr w:type="spellStart"/>
+      <w:r>
+        <w:t>tortor</w:t>
+      </w:r>
+      <w:proofErr w:type="spellEnd"/>
+      <w:r>
+        <w:t xml:space="preserve">. In </w:t>
+      </w:r>
+      <w:proofErr w:type="spellStart"/>
+      <w:r>
+        <w:t>ultricies</w:t>
+      </w:r>
+      <w:proofErr w:type="spellEnd"/>
+      <w:r>
+        <w:t xml:space="preserve"> </w:t>
+      </w:r>
+      <w:proofErr w:type="spellStart"/>
+      <w:r>
+        <w:t>eleifend</w:t>
+      </w:r>
+      <w:proofErr w:type="spellEnd"/>
+      <w:r>
+        <w:t xml:space="preserve"> ante, </w:t>
+      </w:r>
+      <w:proofErr w:type="spellStart"/>
+      <w:r>
+        <w:t>nec</w:t>
+      </w:r>
+      <w:proofErr w:type="spellEnd"/>
+      <w:r>
+        <w:t xml:space="preserve"> </w:t>
+      </w:r>
+      <w:proofErr w:type="spellStart"/>
+      <w:r>
+        <w:t>fringilla</w:t>
+      </w:r>
+      <w:proofErr w:type="spellEnd"/>
+      <w:r>
+        <w:t xml:space="preserve"> libero </w:t>
+      </w:r>
+      <w:proofErr w:type="spellStart"/>
+      <w:r>
+        <w:t>rutrum</w:t>
+      </w:r>
+      <w:proofErr w:type="spellEnd"/>
+      <w:r>
+        <w:t xml:space="preserve"> vitae.</w:t>
+      </w:r>
+    </w:p>
+    <w:p>
+      <w:pPr>
+        <w:pStyle w:val="Ttulo1"/>
+      </w:pPr>
+      <w:r>
+        <w:t xml:space="preserve">3. </w:t>
+      </w:r>
+      <w:r>
+        <w:rPr>
+          <w:u w:val="single"/>
+        </w:rPr>
+        <w:t>Conclusão</w:t>
+      </w:r>
+    </w:p>
+    <w:p>
+      <w:r>
+        <w:t>É onde o aluno finaliza o trabalho, escrevendo seu ponto de vista sobre o assunto e as conclusões que tirou com a pesquisa realizada.</w:t>
+      </w:r>
+    </w:p>
+    <w:p>
+      <w:pPr>
+        <w:pStyle w:val="Ttulo1"/>
+      </w:pPr>
+      <w:r>
+        <w:t>4. Referências</w:t>
+      </w:r>
+    </w:p>
+    <w:p>
+      <w:r>
+        <w:t>As referências devem estar em ordem alfabética pelo sobrenome dos autores e devem separadas entre si por um espaço simples, alinhadas à esquerda.</w:t>
+      </w:r>
+    </w:p>
+    <w:p>
+      <w:r>
+        <w:t>Uma coisa que recomendo como aluno é colocar os links a medida que vai usando, fazer as referências quando acaba o trabalho é HORRIVEL.</w:t>
+      </w:r>
+    </w:p>
+    <w:p>
+      <w:r>
+        <w:t>Quando acabar, coloque em algum gerador ABNT online, se eu fizer um de código aberto, atualizarei.</w:t>
+      </w:r>
+    </w:p>
+    <w:p>
+      <w:r>
+        <w:t>Também pode usar o do Word (caso esteja usando ele), isso pode exigir configuração extra, por essa razão, não inclui.</w:t>
+      </w:r>
+    </w:p>
+    <w:p>
+      <w:r>
+        <w:t>Só não faça manualmente, isso seria DOLOROSO.</w:t>
+      </w:r>
+    </w:p>
     <w:sectPr>
       <w:pgSz w:w="11906" w:h="16838"/>
       <w:pgMar w:top="1701" w:right="1134" w:bottom="1134" w:left="1701" w:header="708" w:footer="708" w:gutter="0"/>
@@ -493,7 +1633,6 @@
     <w:next w:val="Normal"/>
     <w:link w:val="Ttulo2Char"/>
     <w:uiPriority w:val="9"/>
-    <w:semiHidden/>
     <w:unhideWhenUsed/>
     <w:qFormat/>
     <w:rsid w:val="00B37142"/>
@@ -516,7 +1655,6 @@
     <w:next w:val="Normal"/>
     <w:link w:val="Ttulo3Char"/>
     <w:uiPriority w:val="9"/>
-    <w:semiHidden/>
     <w:unhideWhenUsed/>
     <w:qFormat/>
     <w:rsid w:val="00B37142"/>
@@ -539,7 +1677,6 @@
     <w:next w:val="Normal"/>
     <w:link w:val="Ttulo4Char"/>
     <w:uiPriority w:val="9"/>
-    <w:semiHidden/>
     <w:unhideWhenUsed/>
     <w:qFormat/>
     <w:rsid w:val="00B37142"/>
@@ -562,7 +1699,6 @@
     <w:next w:val="Normal"/>
     <w:link w:val="Ttulo5Char"/>
     <w:uiPriority w:val="9"/>
-    <w:semiHidden/>
     <w:unhideWhenUsed/>
     <w:qFormat/>
     <w:rsid w:val="00B37142"/>
@@ -708,7 +1844,6 @@
     <w:basedOn w:val="Fontepargpadro"/>
     <w:link w:val="Ttulo2"/>
     <w:uiPriority w:val="9"/>
-    <w:semiHidden/>
     <w:rsid w:val="00B37142"/>
     <w:rPr>
       <w:rFonts w:asciiTheme="majorHAnsi" w:eastAsiaTheme="majorEastAsia" w:hAnsiTheme="majorHAnsi" w:cstheme="majorBidi"/>
@@ -722,7 +1857,6 @@
     <w:basedOn w:val="Fontepargpadro"/>
     <w:link w:val="Ttulo3"/>
     <w:uiPriority w:val="9"/>
-    <w:semiHidden/>
     <w:rsid w:val="00B37142"/>
     <w:rPr>
       <w:rFonts w:eastAsiaTheme="majorEastAsia" w:cstheme="majorBidi"/>
@@ -736,7 +1870,6 @@
     <w:basedOn w:val="Fontepargpadro"/>
     <w:link w:val="Ttulo4"/>
     <w:uiPriority w:val="9"/>
-    <w:semiHidden/>
     <w:rsid w:val="00B37142"/>
     <w:rPr>
       <w:rFonts w:eastAsiaTheme="majorEastAsia" w:cstheme="majorBidi"/>
@@ -750,7 +1883,6 @@
     <w:basedOn w:val="Fontepargpadro"/>
     <w:link w:val="Ttulo5"/>
     <w:uiPriority w:val="9"/>
-    <w:semiHidden/>
     <w:rsid w:val="00B37142"/>
     <w:rPr>
       <w:rFonts w:eastAsiaTheme="majorEastAsia" w:cstheme="majorBidi"/>
@@ -881,32 +2013,32 @@
   </w:style>
   <w:style w:type="paragraph" w:styleId="Citao">
     <w:name w:val="Quote"/>
+    <w:aliases w:val="Citação (mais de 4 linhas)"/>
     <w:basedOn w:val="Normal"/>
     <w:next w:val="Normal"/>
     <w:link w:val="CitaoChar"/>
     <w:uiPriority w:val="29"/>
     <w:qFormat/>
-    <w:rsid w:val="00B37142"/>
+    <w:rsid w:val="00035F57"/>
     <w:pPr>
-      <w:spacing w:before="160"/>
-      <w:jc w:val="center"/>
+      <w:spacing w:before="160" w:line="240" w:lineRule="auto"/>
+      <w:ind w:left="2268" w:firstLine="0"/>
     </w:pPr>
     <w:rPr>
-      <w:i/>
       <w:iCs/>
-      <w:color w:val="404040" w:themeColor="text1" w:themeTint="BF"/>
+      <w:sz w:val="22"/>
     </w:rPr>
   </w:style>
   <w:style w:type="character" w:customStyle="1" w:styleId="CitaoChar">
     <w:name w:val="Citação Char"/>
+    <w:aliases w:val="Citação (mais de 4 linhas) Char"/>
     <w:basedOn w:val="Fontepargpadro"/>
     <w:link w:val="Citao"/>
     <w:uiPriority w:val="29"/>
-    <w:rsid w:val="00B37142"/>
-    <w:rPr>
-      <w:i/>
+    <w:rsid w:val="00035F57"/>
+    <w:rPr>
       <w:iCs/>
-      <w:color w:val="404040" w:themeColor="text1" w:themeTint="BF"/>
+      <w:sz w:val="22"/>
     </w:rPr>
   </w:style>
   <w:style w:type="paragraph" w:styleId="PargrafodaLista">
@@ -1024,6 +2156,14 @@
     <w:link w:val="Rodap"/>
     <w:uiPriority w:val="99"/>
     <w:rsid w:val="00BB0CBD"/>
+  </w:style>
+  <w:style w:type="character" w:styleId="Nmerodelinha">
+    <w:name w:val="line number"/>
+    <w:basedOn w:val="Fontepargpadro"/>
+    <w:uiPriority w:val="99"/>
+    <w:semiHidden/>
+    <w:unhideWhenUsed/>
+    <w:rsid w:val="00035F57"/>
   </w:style>
 </w:styles>
 </file>

</xml_diff>

<commit_message>
adicionar numeração, quebras, e está pronto
</commit_message>
<xml_diff>
--- a/TemplateFund2Word.docx
+++ b/TemplateFund2Word.docx
@@ -310,7 +310,7 @@
                 <w:noProof/>
                 <w:webHidden/>
               </w:rPr>
-              <w:t>2</w:t>
+              <w:t>3</w:t>
             </w:r>
             <w:r>
               <w:rPr>
@@ -382,7 +382,7 @@
                 <w:noProof/>
                 <w:webHidden/>
               </w:rPr>
-              <w:t>2</w:t>
+              <w:t>3</w:t>
             </w:r>
             <w:r>
               <w:rPr>
@@ -450,7 +450,7 @@
                 <w:noProof/>
                 <w:webHidden/>
               </w:rPr>
-              <w:t>2</w:t>
+              <w:t>3</w:t>
             </w:r>
             <w:r>
               <w:rPr>
@@ -589,7 +589,7 @@
                 <w:noProof/>
                 <w:webHidden/>
               </w:rPr>
-              <w:t>3</w:t>
+              <w:t>4</w:t>
             </w:r>
             <w:r>
               <w:rPr>
@@ -660,7 +660,7 @@
                 <w:noProof/>
                 <w:webHidden/>
               </w:rPr>
-              <w:t>3</w:t>
+              <w:t>4</w:t>
             </w:r>
             <w:r>
               <w:rPr>
@@ -730,7 +730,7 @@
                 <w:noProof/>
                 <w:webHidden/>
               </w:rPr>
-              <w:t>3</w:t>
+              <w:t>4</w:t>
             </w:r>
             <w:r>
               <w:rPr>
@@ -802,7 +802,7 @@
                 <w:noProof/>
                 <w:webHidden/>
               </w:rPr>
-              <w:t>3</w:t>
+              <w:t>4</w:t>
             </w:r>
             <w:r>
               <w:rPr>
@@ -874,7 +874,7 @@
                 <w:noProof/>
                 <w:webHidden/>
               </w:rPr>
-              <w:t>3</w:t>
+              <w:t>4</w:t>
             </w:r>
             <w:r>
               <w:rPr>
@@ -904,9 +904,22 @@
     <w:p>
       <w:pPr>
         <w:pStyle w:val="Ttulo1"/>
+        <w:sectPr>
+          <w:type w:val="continuous"/>
+          <w:pgSz w:w="11906" w:h="16838"/>
+          <w:pgMar w:top="1701" w:right="1134" w:bottom="1134" w:left="1701" w:header="708" w:footer="708" w:gutter="0"/>
+          <w:cols w:space="708"/>
+          <w:docGrid w:linePitch="360"/>
+        </w:sectPr>
       </w:pPr>
       <w:bookmarkStart w:id="0" w:name="_Toc240207445"/>
-      <w:r>
+    </w:p>
+    <w:p>
+      <w:pPr>
+        <w:pStyle w:val="Ttulo1"/>
+      </w:pPr>
+      <w:r>
+        <w:lastRenderedPageBreak/>
         <w:t>1. Introdução</w:t>
       </w:r>
       <w:bookmarkEnd w:id="0"/>
@@ -961,9 +974,22 @@
     <w:p>
       <w:pPr>
         <w:pStyle w:val="Ttulo1"/>
+        <w:sectPr>
+          <w:headerReference w:type="default" r:id="rId7"/>
+          <w:pgSz w:w="11906" w:h="16838"/>
+          <w:pgMar w:top="1701" w:right="1134" w:bottom="1134" w:left="1701" w:header="708" w:footer="708" w:gutter="0"/>
+          <w:cols w:space="708"/>
+          <w:docGrid w:linePitch="360"/>
+        </w:sectPr>
       </w:pPr>
       <w:bookmarkStart w:id="1" w:name="_Toc240207446"/>
-      <w:r>
+    </w:p>
+    <w:p>
+      <w:pPr>
+        <w:pStyle w:val="Ttulo1"/>
+      </w:pPr>
+      <w:r>
+        <w:lastRenderedPageBreak/>
         <w:t>2. Desenvolvimento</w:t>
       </w:r>
       <w:bookmarkEnd w:id="1"/>
@@ -1013,813 +1039,821 @@
     </w:p>
     <w:p>
       <w:r>
+        <w:t xml:space="preserve">Citações com mais de três linhas devem estar recuadas a 4 cm da margem esquerda, com letra de tamanho menor, espaçamento simples e sem aspas. Este </w:t>
+      </w:r>
+      <w:proofErr w:type="spellStart"/>
+      <w:r>
+        <w:t>template</w:t>
+      </w:r>
+      <w:proofErr w:type="spellEnd"/>
+      <w:r>
+        <w:t xml:space="preserve"> </w:t>
+      </w:r>
+      <w:proofErr w:type="spellStart"/>
+      <w:r>
+        <w:t>ját</w:t>
+      </w:r>
+      <w:proofErr w:type="spellEnd"/>
+      <w:r>
+        <w:t xml:space="preserve"> e inclui o estilo “Citação mais de 4 linhas”, para esse fim. </w:t>
+      </w:r>
+      <w:proofErr w:type="spellStart"/>
+      <w:r>
+        <w:t>Ex</w:t>
+      </w:r>
+      <w:proofErr w:type="spellEnd"/>
+      <w:r>
+        <w:t>:</w:t>
+      </w:r>
+    </w:p>
+    <w:p>
+      <w:pPr>
+        <w:pStyle w:val="Citao"/>
+      </w:pPr>
+      <w:r>
+        <w:t>Arquimedes não é apenas um sujeito muito famoso, como também está muito morto, viveu há mais de 2 mil anos, uma época que ninguém se preocupava em inventar coisas (GOLDSMITH, 2011, p.10)</w:t>
+      </w:r>
+    </w:p>
+    <w:p>
+      <w:r>
+        <w:t xml:space="preserve">Provavelmente é necessário colocar algum espaçamento depois. </w:t>
+      </w:r>
+    </w:p>
+    <w:p>
+      <w:pPr>
+        <w:pStyle w:val="Ttulo2"/>
+      </w:pPr>
+      <w:bookmarkStart w:id="3" w:name="_Toc240207448"/>
+      <w:r>
+        <w:t>2.2 Seção secundária</w:t>
+      </w:r>
+      <w:bookmarkEnd w:id="3"/>
+    </w:p>
+    <w:p>
+      <w:proofErr w:type="spellStart"/>
+      <w:r>
+        <w:t>Lorem</w:t>
+      </w:r>
+      <w:proofErr w:type="spellEnd"/>
+      <w:r>
+        <w:t xml:space="preserve"> ipsum </w:t>
+      </w:r>
+      <w:proofErr w:type="spellStart"/>
+      <w:r>
+        <w:t>dolor</w:t>
+      </w:r>
+      <w:proofErr w:type="spellEnd"/>
+      <w:r>
+        <w:t xml:space="preserve"> </w:t>
+      </w:r>
+      <w:proofErr w:type="spellStart"/>
+      <w:r>
+        <w:t>sit</w:t>
+      </w:r>
+      <w:proofErr w:type="spellEnd"/>
+      <w:r>
+        <w:t xml:space="preserve"> </w:t>
+      </w:r>
+      <w:proofErr w:type="spellStart"/>
+      <w:r>
+        <w:t>amet</w:t>
+      </w:r>
+      <w:proofErr w:type="spellEnd"/>
+      <w:r>
+        <w:t xml:space="preserve">, </w:t>
+      </w:r>
+      <w:proofErr w:type="spellStart"/>
+      <w:r>
+        <w:t>consectetur</w:t>
+      </w:r>
+      <w:proofErr w:type="spellEnd"/>
+      <w:r>
+        <w:t xml:space="preserve"> </w:t>
+      </w:r>
+      <w:proofErr w:type="spellStart"/>
+      <w:r>
+        <w:t>adipiscing</w:t>
+      </w:r>
+      <w:proofErr w:type="spellEnd"/>
+      <w:r>
+        <w:t xml:space="preserve"> </w:t>
+      </w:r>
+      <w:proofErr w:type="spellStart"/>
+      <w:r>
+        <w:t>elit</w:t>
+      </w:r>
+      <w:proofErr w:type="spellEnd"/>
+      <w:r>
+        <w:t xml:space="preserve">. </w:t>
+      </w:r>
+      <w:r>
+        <w:rPr>
+          <w:lang w:val="en-US"/>
+        </w:rPr>
+        <w:t xml:space="preserve">Aenean </w:t>
+      </w:r>
+      <w:proofErr w:type="spellStart"/>
+      <w:r>
+        <w:rPr>
+          <w:lang w:val="en-US"/>
+        </w:rPr>
+        <w:t>tincidunt</w:t>
+      </w:r>
+      <w:proofErr w:type="spellEnd"/>
+      <w:r>
+        <w:rPr>
+          <w:lang w:val="en-US"/>
+        </w:rPr>
+        <w:t xml:space="preserve"> </w:t>
+      </w:r>
+      <w:proofErr w:type="spellStart"/>
+      <w:r>
+        <w:rPr>
+          <w:lang w:val="en-US"/>
+        </w:rPr>
+        <w:t>porttitor</w:t>
+      </w:r>
+      <w:proofErr w:type="spellEnd"/>
+      <w:r>
+        <w:rPr>
+          <w:lang w:val="en-US"/>
+        </w:rPr>
+        <w:t xml:space="preserve"> </w:t>
+      </w:r>
+      <w:proofErr w:type="spellStart"/>
+      <w:r>
+        <w:rPr>
+          <w:lang w:val="en-US"/>
+        </w:rPr>
+        <w:t>nisl</w:t>
+      </w:r>
+      <w:proofErr w:type="spellEnd"/>
+      <w:r>
+        <w:rPr>
+          <w:lang w:val="en-US"/>
+        </w:rPr>
+        <w:t xml:space="preserve">, </w:t>
+      </w:r>
+      <w:proofErr w:type="spellStart"/>
+      <w:r>
+        <w:rPr>
+          <w:lang w:val="en-US"/>
+        </w:rPr>
+        <w:t>finibus</w:t>
+      </w:r>
+      <w:proofErr w:type="spellEnd"/>
+      <w:r>
+        <w:rPr>
+          <w:lang w:val="en-US"/>
+        </w:rPr>
+        <w:t xml:space="preserve"> </w:t>
+      </w:r>
+      <w:proofErr w:type="spellStart"/>
+      <w:r>
+        <w:rPr>
+          <w:lang w:val="en-US"/>
+        </w:rPr>
+        <w:t>sagittis</w:t>
+      </w:r>
+      <w:proofErr w:type="spellEnd"/>
+      <w:r>
+        <w:rPr>
+          <w:lang w:val="en-US"/>
+        </w:rPr>
+        <w:t xml:space="preserve"> </w:t>
+      </w:r>
+      <w:proofErr w:type="spellStart"/>
+      <w:r>
+        <w:rPr>
+          <w:lang w:val="en-US"/>
+        </w:rPr>
+        <w:t>odio</w:t>
+      </w:r>
+      <w:proofErr w:type="spellEnd"/>
+      <w:r>
+        <w:rPr>
+          <w:lang w:val="en-US"/>
+        </w:rPr>
+        <w:t xml:space="preserve"> </w:t>
+      </w:r>
+      <w:proofErr w:type="spellStart"/>
+      <w:r>
+        <w:rPr>
+          <w:lang w:val="en-US"/>
+        </w:rPr>
+        <w:t>ullamcorper</w:t>
+      </w:r>
+      <w:proofErr w:type="spellEnd"/>
+      <w:r>
+        <w:rPr>
+          <w:lang w:val="en-US"/>
+        </w:rPr>
+        <w:t xml:space="preserve"> non. </w:t>
+      </w:r>
+      <w:proofErr w:type="spellStart"/>
+      <w:r>
+        <w:t>Sed</w:t>
+      </w:r>
+      <w:proofErr w:type="spellEnd"/>
+      <w:r>
+        <w:t xml:space="preserve"> </w:t>
+      </w:r>
+      <w:proofErr w:type="spellStart"/>
+      <w:r>
+        <w:t>euismod</w:t>
+      </w:r>
+      <w:proofErr w:type="spellEnd"/>
+      <w:r>
+        <w:t xml:space="preserve"> </w:t>
+      </w:r>
+      <w:proofErr w:type="spellStart"/>
+      <w:r>
+        <w:t>rutrum</w:t>
+      </w:r>
+      <w:proofErr w:type="spellEnd"/>
+      <w:r>
+        <w:t xml:space="preserve"> </w:t>
+      </w:r>
+      <w:proofErr w:type="spellStart"/>
+      <w:r>
+        <w:t>eros</w:t>
+      </w:r>
+      <w:proofErr w:type="spellEnd"/>
+      <w:r>
+        <w:t xml:space="preserve">, </w:t>
+      </w:r>
+      <w:proofErr w:type="spellStart"/>
+      <w:r>
+        <w:t>nec</w:t>
+      </w:r>
+      <w:proofErr w:type="spellEnd"/>
+      <w:r>
+        <w:t xml:space="preserve"> </w:t>
+      </w:r>
+      <w:proofErr w:type="spellStart"/>
+      <w:r>
+        <w:t>volutpat</w:t>
+      </w:r>
+      <w:proofErr w:type="spellEnd"/>
+      <w:r>
+        <w:t xml:space="preserve"> ante </w:t>
+      </w:r>
+      <w:proofErr w:type="spellStart"/>
+      <w:r>
+        <w:t>luctus</w:t>
+      </w:r>
+      <w:proofErr w:type="spellEnd"/>
+      <w:r>
+        <w:t xml:space="preserve"> a.</w:t>
+      </w:r>
+    </w:p>
+    <w:p>
+      <w:pPr>
+        <w:pStyle w:val="Ttulo3"/>
+      </w:pPr>
+      <w:bookmarkStart w:id="4" w:name="_Toc240207449"/>
+      <w:r>
+        <w:t>2.2.1 Seção terciária</w:t>
+      </w:r>
+      <w:bookmarkEnd w:id="4"/>
+    </w:p>
+    <w:p>
+      <w:pPr>
+        <w:rPr>
+          <w:lang w:val="en-US"/>
+        </w:rPr>
+      </w:pPr>
+      <w:proofErr w:type="spellStart"/>
+      <w:r>
+        <w:rPr>
+          <w:lang w:val="en-US"/>
+        </w:rPr>
+        <w:t>Pellentesque</w:t>
+      </w:r>
+      <w:proofErr w:type="spellEnd"/>
+      <w:r>
+        <w:rPr>
+          <w:lang w:val="en-US"/>
+        </w:rPr>
+        <w:t xml:space="preserve"> </w:t>
+      </w:r>
+      <w:proofErr w:type="spellStart"/>
+      <w:r>
+        <w:rPr>
+          <w:lang w:val="en-US"/>
+        </w:rPr>
+        <w:t>elit</w:t>
+      </w:r>
+      <w:proofErr w:type="spellEnd"/>
+      <w:r>
+        <w:rPr>
+          <w:lang w:val="en-US"/>
+        </w:rPr>
+        <w:t xml:space="preserve"> </w:t>
+      </w:r>
+      <w:proofErr w:type="spellStart"/>
+      <w:r>
+        <w:rPr>
+          <w:lang w:val="en-US"/>
+        </w:rPr>
+        <w:t>sem</w:t>
+      </w:r>
+      <w:proofErr w:type="spellEnd"/>
+      <w:r>
+        <w:rPr>
+          <w:lang w:val="en-US"/>
+        </w:rPr>
+        <w:t xml:space="preserve">, </w:t>
+      </w:r>
+      <w:proofErr w:type="spellStart"/>
+      <w:r>
+        <w:rPr>
+          <w:lang w:val="en-US"/>
+        </w:rPr>
+        <w:t>aliquet</w:t>
+      </w:r>
+      <w:proofErr w:type="spellEnd"/>
+      <w:r>
+        <w:rPr>
+          <w:lang w:val="en-US"/>
+        </w:rPr>
+        <w:t xml:space="preserve"> sed </w:t>
+      </w:r>
+      <w:proofErr w:type="spellStart"/>
+      <w:r>
+        <w:rPr>
+          <w:lang w:val="en-US"/>
+        </w:rPr>
+        <w:t>efficitur</w:t>
+      </w:r>
+      <w:proofErr w:type="spellEnd"/>
+      <w:r>
+        <w:rPr>
+          <w:lang w:val="en-US"/>
+        </w:rPr>
+        <w:t xml:space="preserve"> sit </w:t>
+      </w:r>
+      <w:proofErr w:type="spellStart"/>
+      <w:r>
+        <w:rPr>
+          <w:lang w:val="en-US"/>
+        </w:rPr>
+        <w:t>amet</w:t>
+      </w:r>
+      <w:proofErr w:type="spellEnd"/>
+      <w:r>
+        <w:rPr>
+          <w:lang w:val="en-US"/>
+        </w:rPr>
+        <w:t xml:space="preserve">, </w:t>
+      </w:r>
+      <w:proofErr w:type="spellStart"/>
+      <w:r>
+        <w:rPr>
+          <w:lang w:val="en-US"/>
+        </w:rPr>
+        <w:t>efficitur</w:t>
+      </w:r>
+      <w:proofErr w:type="spellEnd"/>
+      <w:r>
+        <w:rPr>
+          <w:lang w:val="en-US"/>
+        </w:rPr>
+        <w:t xml:space="preserve"> in </w:t>
+      </w:r>
+      <w:proofErr w:type="spellStart"/>
+      <w:r>
+        <w:rPr>
+          <w:lang w:val="en-US"/>
+        </w:rPr>
+        <w:t>turpis</w:t>
+      </w:r>
+      <w:proofErr w:type="spellEnd"/>
+      <w:r>
+        <w:rPr>
+          <w:lang w:val="en-US"/>
+        </w:rPr>
+        <w:t xml:space="preserve">. Proin et </w:t>
+      </w:r>
+      <w:proofErr w:type="spellStart"/>
+      <w:r>
+        <w:rPr>
+          <w:lang w:val="en-US"/>
+        </w:rPr>
+        <w:t>risus</w:t>
+      </w:r>
+      <w:proofErr w:type="spellEnd"/>
+      <w:r>
+        <w:rPr>
+          <w:lang w:val="en-US"/>
+        </w:rPr>
+        <w:t xml:space="preserve"> </w:t>
+      </w:r>
+      <w:proofErr w:type="spellStart"/>
+      <w:r>
+        <w:rPr>
+          <w:lang w:val="en-US"/>
+        </w:rPr>
+        <w:t>felis</w:t>
+      </w:r>
+      <w:proofErr w:type="spellEnd"/>
+      <w:r>
+        <w:rPr>
+          <w:lang w:val="en-US"/>
+        </w:rPr>
+        <w:t xml:space="preserve">. Duis sit </w:t>
+      </w:r>
+      <w:proofErr w:type="spellStart"/>
+      <w:r>
+        <w:rPr>
+          <w:lang w:val="en-US"/>
+        </w:rPr>
+        <w:t>amet</w:t>
+      </w:r>
+      <w:proofErr w:type="spellEnd"/>
+      <w:r>
+        <w:rPr>
+          <w:lang w:val="en-US"/>
+        </w:rPr>
+        <w:t xml:space="preserve"> </w:t>
+      </w:r>
+      <w:proofErr w:type="spellStart"/>
+      <w:r>
+        <w:rPr>
+          <w:lang w:val="en-US"/>
+        </w:rPr>
+        <w:t>efficitur</w:t>
+      </w:r>
+      <w:proofErr w:type="spellEnd"/>
+      <w:r>
+        <w:rPr>
+          <w:lang w:val="en-US"/>
+        </w:rPr>
+        <w:t xml:space="preserve"> lorem, sed auctor </w:t>
+      </w:r>
+      <w:proofErr w:type="spellStart"/>
+      <w:r>
+        <w:rPr>
+          <w:lang w:val="en-US"/>
+        </w:rPr>
+        <w:t>orci</w:t>
+      </w:r>
+      <w:proofErr w:type="spellEnd"/>
+    </w:p>
+    <w:p>
+      <w:pPr>
+        <w:pStyle w:val="Ttulo4"/>
+      </w:pPr>
+      <w:bookmarkStart w:id="5" w:name="_Toc240207450"/>
+      <w:r>
+        <w:t xml:space="preserve">2.2.1.1 Seção </w:t>
+      </w:r>
+      <w:proofErr w:type="spellStart"/>
+      <w:r>
+        <w:t>quartenária</w:t>
+      </w:r>
+      <w:bookmarkEnd w:id="5"/>
+      <w:proofErr w:type="spellEnd"/>
+    </w:p>
+    <w:p>
+      <w:proofErr w:type="spellStart"/>
+      <w:r>
+        <w:t>Pellentesque</w:t>
+      </w:r>
+      <w:proofErr w:type="spellEnd"/>
+      <w:r>
+        <w:t xml:space="preserve"> </w:t>
+      </w:r>
+      <w:proofErr w:type="spellStart"/>
+      <w:r>
+        <w:t>at</w:t>
+      </w:r>
+      <w:proofErr w:type="spellEnd"/>
+      <w:r>
+        <w:t xml:space="preserve"> est </w:t>
+      </w:r>
+      <w:proofErr w:type="spellStart"/>
+      <w:r>
+        <w:t>rutrum</w:t>
+      </w:r>
+      <w:proofErr w:type="spellEnd"/>
+      <w:r>
+        <w:t xml:space="preserve">, </w:t>
+      </w:r>
+      <w:proofErr w:type="spellStart"/>
+      <w:r>
+        <w:t>efficitur</w:t>
+      </w:r>
+      <w:proofErr w:type="spellEnd"/>
+      <w:r>
+        <w:t xml:space="preserve"> </w:t>
+      </w:r>
+      <w:proofErr w:type="spellStart"/>
+      <w:r>
+        <w:t>lacus</w:t>
+      </w:r>
+      <w:proofErr w:type="spellEnd"/>
+      <w:r>
+        <w:t xml:space="preserve"> ac, </w:t>
+      </w:r>
+      <w:proofErr w:type="spellStart"/>
+      <w:r>
+        <w:t>mollis</w:t>
+      </w:r>
+      <w:proofErr w:type="spellEnd"/>
+      <w:r>
+        <w:t xml:space="preserve"> </w:t>
+      </w:r>
+      <w:proofErr w:type="spellStart"/>
+      <w:r>
+        <w:t>sapien</w:t>
+      </w:r>
+      <w:proofErr w:type="spellEnd"/>
+      <w:r>
+        <w:t xml:space="preserve">. </w:t>
+      </w:r>
+      <w:proofErr w:type="spellStart"/>
+      <w:r>
+        <w:t>Aenean</w:t>
+      </w:r>
+      <w:proofErr w:type="spellEnd"/>
+      <w:r>
+        <w:t xml:space="preserve"> magna </w:t>
+      </w:r>
+      <w:proofErr w:type="spellStart"/>
+      <w:r>
+        <w:t>lorem</w:t>
+      </w:r>
+      <w:proofErr w:type="spellEnd"/>
+      <w:r>
+        <w:t xml:space="preserve">, </w:t>
+      </w:r>
+      <w:proofErr w:type="spellStart"/>
+      <w:r>
+        <w:t>mattis</w:t>
+      </w:r>
+      <w:proofErr w:type="spellEnd"/>
+      <w:r>
+        <w:t xml:space="preserve"> ac </w:t>
+      </w:r>
+      <w:proofErr w:type="spellStart"/>
+      <w:r>
+        <w:t>ligula</w:t>
+      </w:r>
+      <w:proofErr w:type="spellEnd"/>
+      <w:r>
+        <w:t xml:space="preserve"> et, </w:t>
+      </w:r>
+      <w:proofErr w:type="spellStart"/>
+      <w:r>
+        <w:t>auctor</w:t>
+      </w:r>
+      <w:proofErr w:type="spellEnd"/>
+      <w:r>
+        <w:t xml:space="preserve"> </w:t>
+      </w:r>
+      <w:proofErr w:type="spellStart"/>
+      <w:r>
+        <w:t>luctus</w:t>
+      </w:r>
+      <w:proofErr w:type="spellEnd"/>
+      <w:r>
+        <w:t xml:space="preserve"> ex. </w:t>
+      </w:r>
+    </w:p>
+    <w:p>
+      <w:pPr>
+        <w:pStyle w:val="Ttulo5"/>
+      </w:pPr>
+      <w:bookmarkStart w:id="6" w:name="_Toc240207451"/>
+      <w:r>
+        <w:t>2.2.1.1.1 Seção quinária</w:t>
+      </w:r>
+      <w:bookmarkEnd w:id="6"/>
+    </w:p>
+    <w:p>
+      <w:pPr>
+        <w:sectPr>
+          <w:pgSz w:w="11906" w:h="16838"/>
+          <w:pgMar w:top="1701" w:right="1134" w:bottom="1134" w:left="1701" w:header="708" w:footer="708" w:gutter="0"/>
+          <w:cols w:space="708"/>
+          <w:docGrid w:linePitch="360"/>
+        </w:sectPr>
+      </w:pPr>
+      <w:r>
+        <w:tab/>
+      </w:r>
+      <w:proofErr w:type="spellStart"/>
+      <w:r>
+        <w:t>Vivamus</w:t>
+      </w:r>
+      <w:proofErr w:type="spellEnd"/>
+      <w:r>
+        <w:t xml:space="preserve"> vitae </w:t>
+      </w:r>
+      <w:proofErr w:type="spellStart"/>
+      <w:r>
+        <w:t>posuere</w:t>
+      </w:r>
+      <w:proofErr w:type="spellEnd"/>
+      <w:r>
+        <w:t xml:space="preserve"> </w:t>
+      </w:r>
+      <w:proofErr w:type="spellStart"/>
+      <w:r>
+        <w:t>nisl</w:t>
+      </w:r>
+      <w:proofErr w:type="spellEnd"/>
+      <w:r>
+        <w:t xml:space="preserve">, eu </w:t>
+      </w:r>
+      <w:proofErr w:type="spellStart"/>
+      <w:r>
+        <w:t>scelerisque</w:t>
+      </w:r>
+      <w:proofErr w:type="spellEnd"/>
+      <w:r>
+        <w:t xml:space="preserve"> </w:t>
+      </w:r>
+      <w:proofErr w:type="spellStart"/>
+      <w:r>
+        <w:t>dolor</w:t>
+      </w:r>
+      <w:proofErr w:type="spellEnd"/>
+      <w:r>
+        <w:t xml:space="preserve">. </w:t>
+      </w:r>
+      <w:r>
+        <w:rPr>
+          <w:lang w:val="en-US"/>
+        </w:rPr>
+        <w:t xml:space="preserve">Proin </w:t>
+      </w:r>
+      <w:proofErr w:type="spellStart"/>
+      <w:r>
+        <w:rPr>
+          <w:lang w:val="en-US"/>
+        </w:rPr>
+        <w:t>aliquam</w:t>
+      </w:r>
+      <w:proofErr w:type="spellEnd"/>
+      <w:r>
+        <w:rPr>
+          <w:lang w:val="en-US"/>
+        </w:rPr>
+        <w:t xml:space="preserve"> </w:t>
+      </w:r>
+      <w:proofErr w:type="spellStart"/>
+      <w:r>
+        <w:rPr>
+          <w:lang w:val="en-US"/>
+        </w:rPr>
+        <w:t>sollicitudin</w:t>
+      </w:r>
+      <w:proofErr w:type="spellEnd"/>
+      <w:r>
+        <w:rPr>
+          <w:lang w:val="en-US"/>
+        </w:rPr>
+        <w:t xml:space="preserve"> </w:t>
+      </w:r>
+      <w:proofErr w:type="spellStart"/>
+      <w:r>
+        <w:rPr>
+          <w:lang w:val="en-US"/>
+        </w:rPr>
+        <w:t>elit</w:t>
+      </w:r>
+      <w:proofErr w:type="spellEnd"/>
+      <w:r>
+        <w:rPr>
+          <w:lang w:val="en-US"/>
+        </w:rPr>
+        <w:t xml:space="preserve"> nec </w:t>
+      </w:r>
+      <w:proofErr w:type="spellStart"/>
+      <w:r>
+        <w:rPr>
+          <w:lang w:val="en-US"/>
+        </w:rPr>
+        <w:t>laoreet</w:t>
+      </w:r>
+      <w:proofErr w:type="spellEnd"/>
+      <w:r>
+        <w:rPr>
+          <w:lang w:val="en-US"/>
+        </w:rPr>
+        <w:t xml:space="preserve">. </w:t>
+      </w:r>
+      <w:proofErr w:type="spellStart"/>
+      <w:r>
+        <w:t>Nulla</w:t>
+      </w:r>
+      <w:proofErr w:type="spellEnd"/>
+      <w:r>
+        <w:t xml:space="preserve"> </w:t>
+      </w:r>
+      <w:proofErr w:type="spellStart"/>
+      <w:r>
+        <w:t>eget</w:t>
+      </w:r>
+      <w:proofErr w:type="spellEnd"/>
+      <w:r>
+        <w:t xml:space="preserve"> </w:t>
+      </w:r>
+      <w:proofErr w:type="spellStart"/>
+      <w:r>
+        <w:t>tincidunt</w:t>
+      </w:r>
+      <w:proofErr w:type="spellEnd"/>
+      <w:r>
+        <w:t xml:space="preserve"> </w:t>
+      </w:r>
+      <w:proofErr w:type="spellStart"/>
+      <w:r>
+        <w:t>eros</w:t>
+      </w:r>
+      <w:proofErr w:type="spellEnd"/>
+      <w:r>
+        <w:t xml:space="preserve">, </w:t>
+      </w:r>
+      <w:proofErr w:type="spellStart"/>
+      <w:r>
+        <w:t>eget</w:t>
+      </w:r>
+      <w:proofErr w:type="spellEnd"/>
+      <w:r>
+        <w:t xml:space="preserve"> </w:t>
+      </w:r>
+      <w:proofErr w:type="spellStart"/>
+      <w:r>
+        <w:t>efficitur</w:t>
+      </w:r>
+      <w:proofErr w:type="spellEnd"/>
+      <w:r>
+        <w:t xml:space="preserve"> </w:t>
+      </w:r>
+      <w:proofErr w:type="spellStart"/>
+      <w:r>
+        <w:t>tortor</w:t>
+      </w:r>
+      <w:proofErr w:type="spellEnd"/>
+      <w:r>
+        <w:t xml:space="preserve">. In </w:t>
+      </w:r>
+      <w:proofErr w:type="spellStart"/>
+      <w:r>
+        <w:t>ultricies</w:t>
+      </w:r>
+      <w:proofErr w:type="spellEnd"/>
+      <w:r>
+        <w:t xml:space="preserve"> </w:t>
+      </w:r>
+      <w:proofErr w:type="spellStart"/>
+      <w:r>
+        <w:t>eleifend</w:t>
+      </w:r>
+      <w:proofErr w:type="spellEnd"/>
+      <w:r>
+        <w:t xml:space="preserve"> </w:t>
+      </w:r>
+      <w:proofErr w:type="gramStart"/>
+      <w:r>
+        <w:t xml:space="preserve">ante, </w:t>
+      </w:r>
+      <w:proofErr w:type="spellStart"/>
+      <w:r>
+        <w:t>nec</w:t>
+      </w:r>
+      <w:proofErr w:type="spellEnd"/>
+      <w:proofErr w:type="gramEnd"/>
+      <w:r>
+        <w:t xml:space="preserve"> </w:t>
+      </w:r>
+      <w:proofErr w:type="spellStart"/>
+      <w:r>
+        <w:t>fringilla</w:t>
+      </w:r>
+      <w:proofErr w:type="spellEnd"/>
+      <w:r>
+        <w:t xml:space="preserve"> libero </w:t>
+      </w:r>
+      <w:proofErr w:type="spellStart"/>
+      <w:r>
+        <w:t>rutrum</w:t>
+      </w:r>
+      <w:proofErr w:type="spellEnd"/>
+      <w:r>
+        <w:t xml:space="preserve"> vitae.</w:t>
+      </w:r>
+    </w:p>
+    <w:p>
+      <w:pPr>
+        <w:pStyle w:val="Ttulo1"/>
+      </w:pPr>
+      <w:bookmarkStart w:id="7" w:name="_Toc240207452"/>
+      <w:r>
         <w:lastRenderedPageBreak/>
-        <w:t xml:space="preserve">Citações com mais de três linhas devem estar recuadas a 4 cm da margem esquerda, com letra de tamanho menor, espaçamento simples e sem aspas. Este </w:t>
-      </w:r>
-      <w:proofErr w:type="spellStart"/>
-      <w:r>
-        <w:t>template</w:t>
-      </w:r>
-      <w:proofErr w:type="spellEnd"/>
-      <w:r>
-        <w:t xml:space="preserve"> </w:t>
-      </w:r>
-      <w:proofErr w:type="spellStart"/>
-      <w:r>
-        <w:t>ját</w:t>
-      </w:r>
-      <w:proofErr w:type="spellEnd"/>
-      <w:r>
-        <w:t xml:space="preserve"> e inclui o estilo “Citação mais de 4 linhas”, para esse fim. </w:t>
-      </w:r>
-      <w:proofErr w:type="spellStart"/>
-      <w:r>
-        <w:t>Ex</w:t>
-      </w:r>
-      <w:proofErr w:type="spellEnd"/>
-      <w:r>
-        <w:t>:</w:t>
-      </w:r>
-    </w:p>
-    <w:p>
-      <w:pPr>
-        <w:pStyle w:val="Citao"/>
-      </w:pPr>
-      <w:r>
-        <w:t>Arquimedes não é apenas um sujeito muito famoso, como também está muito morto, viveu há mais de 2 mil anos, uma época que ninguém se preocupava em inventar coisas (GOLDSMITH, 2011, p.10)</w:t>
-      </w:r>
-    </w:p>
-    <w:p>
-      <w:r>
-        <w:t xml:space="preserve">Provavelmente é necessário colocar algum espaçamento depois. </w:t>
-      </w:r>
-    </w:p>
-    <w:p>
-      <w:pPr>
-        <w:pStyle w:val="Ttulo2"/>
-      </w:pPr>
-      <w:bookmarkStart w:id="3" w:name="_Toc240207448"/>
-      <w:r>
-        <w:t>2.2 Seção secundária</w:t>
-      </w:r>
-      <w:bookmarkEnd w:id="3"/>
-    </w:p>
-    <w:p>
-      <w:proofErr w:type="spellStart"/>
-      <w:r>
-        <w:t>Lorem</w:t>
-      </w:r>
-      <w:proofErr w:type="spellEnd"/>
-      <w:r>
-        <w:t xml:space="preserve"> ipsum </w:t>
-      </w:r>
-      <w:proofErr w:type="spellStart"/>
-      <w:r>
-        <w:t>dolor</w:t>
-      </w:r>
-      <w:proofErr w:type="spellEnd"/>
-      <w:r>
-        <w:t xml:space="preserve"> </w:t>
-      </w:r>
-      <w:proofErr w:type="spellStart"/>
-      <w:r>
-        <w:t>sit</w:t>
-      </w:r>
-      <w:proofErr w:type="spellEnd"/>
-      <w:r>
-        <w:t xml:space="preserve"> </w:t>
-      </w:r>
-      <w:proofErr w:type="spellStart"/>
-      <w:r>
-        <w:t>amet</w:t>
-      </w:r>
-      <w:proofErr w:type="spellEnd"/>
-      <w:r>
-        <w:t xml:space="preserve">, </w:t>
-      </w:r>
-      <w:proofErr w:type="spellStart"/>
-      <w:r>
-        <w:t>consectetur</w:t>
-      </w:r>
-      <w:proofErr w:type="spellEnd"/>
-      <w:r>
-        <w:t xml:space="preserve"> </w:t>
-      </w:r>
-      <w:proofErr w:type="spellStart"/>
-      <w:r>
-        <w:t>adipiscing</w:t>
-      </w:r>
-      <w:proofErr w:type="spellEnd"/>
-      <w:r>
-        <w:t xml:space="preserve"> </w:t>
-      </w:r>
-      <w:proofErr w:type="spellStart"/>
-      <w:r>
-        <w:t>elit</w:t>
-      </w:r>
-      <w:proofErr w:type="spellEnd"/>
-      <w:r>
-        <w:t xml:space="preserve">. </w:t>
-      </w:r>
-      <w:r>
-        <w:rPr>
-          <w:lang w:val="en-US"/>
-        </w:rPr>
-        <w:t xml:space="preserve">Aenean </w:t>
-      </w:r>
-      <w:proofErr w:type="spellStart"/>
-      <w:r>
-        <w:rPr>
-          <w:lang w:val="en-US"/>
-        </w:rPr>
-        <w:t>tincidunt</w:t>
-      </w:r>
-      <w:proofErr w:type="spellEnd"/>
-      <w:r>
-        <w:rPr>
-          <w:lang w:val="en-US"/>
-        </w:rPr>
-        <w:t xml:space="preserve"> </w:t>
-      </w:r>
-      <w:proofErr w:type="spellStart"/>
-      <w:r>
-        <w:rPr>
-          <w:lang w:val="en-US"/>
-        </w:rPr>
-        <w:t>porttitor</w:t>
-      </w:r>
-      <w:proofErr w:type="spellEnd"/>
-      <w:r>
-        <w:rPr>
-          <w:lang w:val="en-US"/>
-        </w:rPr>
-        <w:t xml:space="preserve"> </w:t>
-      </w:r>
-      <w:proofErr w:type="spellStart"/>
-      <w:r>
-        <w:rPr>
-          <w:lang w:val="en-US"/>
-        </w:rPr>
-        <w:t>nisl</w:t>
-      </w:r>
-      <w:proofErr w:type="spellEnd"/>
-      <w:r>
-        <w:rPr>
-          <w:lang w:val="en-US"/>
-        </w:rPr>
-        <w:t xml:space="preserve">, </w:t>
-      </w:r>
-      <w:proofErr w:type="spellStart"/>
-      <w:r>
-        <w:rPr>
-          <w:lang w:val="en-US"/>
-        </w:rPr>
-        <w:t>finibus</w:t>
-      </w:r>
-      <w:proofErr w:type="spellEnd"/>
-      <w:r>
-        <w:rPr>
-          <w:lang w:val="en-US"/>
-        </w:rPr>
-        <w:t xml:space="preserve"> </w:t>
-      </w:r>
-      <w:proofErr w:type="spellStart"/>
-      <w:r>
-        <w:rPr>
-          <w:lang w:val="en-US"/>
-        </w:rPr>
-        <w:t>sagittis</w:t>
-      </w:r>
-      <w:proofErr w:type="spellEnd"/>
-      <w:r>
-        <w:rPr>
-          <w:lang w:val="en-US"/>
-        </w:rPr>
-        <w:t xml:space="preserve"> </w:t>
-      </w:r>
-      <w:proofErr w:type="spellStart"/>
-      <w:r>
-        <w:rPr>
-          <w:lang w:val="en-US"/>
-        </w:rPr>
-        <w:t>odio</w:t>
-      </w:r>
-      <w:proofErr w:type="spellEnd"/>
-      <w:r>
-        <w:rPr>
-          <w:lang w:val="en-US"/>
-        </w:rPr>
-        <w:t xml:space="preserve"> </w:t>
-      </w:r>
-      <w:proofErr w:type="spellStart"/>
-      <w:r>
-        <w:rPr>
-          <w:lang w:val="en-US"/>
-        </w:rPr>
-        <w:t>ullamcorper</w:t>
-      </w:r>
-      <w:proofErr w:type="spellEnd"/>
-      <w:r>
-        <w:rPr>
-          <w:lang w:val="en-US"/>
-        </w:rPr>
-        <w:t xml:space="preserve"> non. </w:t>
-      </w:r>
-      <w:proofErr w:type="spellStart"/>
-      <w:r>
-        <w:t>Sed</w:t>
-      </w:r>
-      <w:proofErr w:type="spellEnd"/>
-      <w:r>
-        <w:t xml:space="preserve"> </w:t>
-      </w:r>
-      <w:proofErr w:type="spellStart"/>
-      <w:r>
-        <w:t>euismod</w:t>
-      </w:r>
-      <w:proofErr w:type="spellEnd"/>
-      <w:r>
-        <w:t xml:space="preserve"> </w:t>
-      </w:r>
-      <w:proofErr w:type="spellStart"/>
-      <w:r>
-        <w:t>rutrum</w:t>
-      </w:r>
-      <w:proofErr w:type="spellEnd"/>
-      <w:r>
-        <w:t xml:space="preserve"> </w:t>
-      </w:r>
-      <w:proofErr w:type="spellStart"/>
-      <w:r>
-        <w:t>eros</w:t>
-      </w:r>
-      <w:proofErr w:type="spellEnd"/>
-      <w:r>
-        <w:t xml:space="preserve">, </w:t>
-      </w:r>
-      <w:proofErr w:type="spellStart"/>
-      <w:r>
-        <w:t>nec</w:t>
-      </w:r>
-      <w:proofErr w:type="spellEnd"/>
-      <w:r>
-        <w:t xml:space="preserve"> </w:t>
-      </w:r>
-      <w:proofErr w:type="spellStart"/>
-      <w:r>
-        <w:t>volutpat</w:t>
-      </w:r>
-      <w:proofErr w:type="spellEnd"/>
-      <w:r>
-        <w:t xml:space="preserve"> ante </w:t>
-      </w:r>
-      <w:proofErr w:type="spellStart"/>
-      <w:r>
-        <w:t>luctus</w:t>
-      </w:r>
-      <w:proofErr w:type="spellEnd"/>
-      <w:r>
-        <w:t xml:space="preserve"> a.</w:t>
-      </w:r>
-    </w:p>
-    <w:p>
-      <w:pPr>
-        <w:pStyle w:val="Ttulo3"/>
-      </w:pPr>
-      <w:bookmarkStart w:id="4" w:name="_Toc240207449"/>
-      <w:r>
-        <w:t>2.2.1 Seção terciária</w:t>
-      </w:r>
-      <w:bookmarkEnd w:id="4"/>
-    </w:p>
-    <w:p>
-      <w:pPr>
-        <w:rPr>
-          <w:lang w:val="en-US"/>
-        </w:rPr>
-      </w:pPr>
-      <w:proofErr w:type="spellStart"/>
-      <w:r>
-        <w:rPr>
-          <w:lang w:val="en-US"/>
-        </w:rPr>
-        <w:t>Pellentesque</w:t>
-      </w:r>
-      <w:proofErr w:type="spellEnd"/>
-      <w:r>
-        <w:rPr>
-          <w:lang w:val="en-US"/>
-        </w:rPr>
-        <w:t xml:space="preserve"> </w:t>
-      </w:r>
-      <w:proofErr w:type="spellStart"/>
-      <w:r>
-        <w:rPr>
-          <w:lang w:val="en-US"/>
-        </w:rPr>
-        <w:t>elit</w:t>
-      </w:r>
-      <w:proofErr w:type="spellEnd"/>
-      <w:r>
-        <w:rPr>
-          <w:lang w:val="en-US"/>
-        </w:rPr>
-        <w:t xml:space="preserve"> </w:t>
-      </w:r>
-      <w:proofErr w:type="spellStart"/>
-      <w:r>
-        <w:rPr>
-          <w:lang w:val="en-US"/>
-        </w:rPr>
-        <w:t>sem</w:t>
-      </w:r>
-      <w:proofErr w:type="spellEnd"/>
-      <w:r>
-        <w:rPr>
-          <w:lang w:val="en-US"/>
-        </w:rPr>
-        <w:t xml:space="preserve">, </w:t>
-      </w:r>
-      <w:proofErr w:type="spellStart"/>
-      <w:r>
-        <w:rPr>
-          <w:lang w:val="en-US"/>
-        </w:rPr>
-        <w:t>aliquet</w:t>
-      </w:r>
-      <w:proofErr w:type="spellEnd"/>
-      <w:r>
-        <w:rPr>
-          <w:lang w:val="en-US"/>
-        </w:rPr>
-        <w:t xml:space="preserve"> sed </w:t>
-      </w:r>
-      <w:proofErr w:type="spellStart"/>
-      <w:r>
-        <w:rPr>
-          <w:lang w:val="en-US"/>
-        </w:rPr>
-        <w:t>efficitur</w:t>
-      </w:r>
-      <w:proofErr w:type="spellEnd"/>
-      <w:r>
-        <w:rPr>
-          <w:lang w:val="en-US"/>
-        </w:rPr>
-        <w:t xml:space="preserve"> sit </w:t>
-      </w:r>
-      <w:proofErr w:type="spellStart"/>
-      <w:r>
-        <w:rPr>
-          <w:lang w:val="en-US"/>
-        </w:rPr>
-        <w:t>amet</w:t>
-      </w:r>
-      <w:proofErr w:type="spellEnd"/>
-      <w:r>
-        <w:rPr>
-          <w:lang w:val="en-US"/>
-        </w:rPr>
-        <w:t xml:space="preserve">, </w:t>
-      </w:r>
-      <w:proofErr w:type="spellStart"/>
-      <w:r>
-        <w:rPr>
-          <w:lang w:val="en-US"/>
-        </w:rPr>
-        <w:t>efficitur</w:t>
-      </w:r>
-      <w:proofErr w:type="spellEnd"/>
-      <w:r>
-        <w:rPr>
-          <w:lang w:val="en-US"/>
-        </w:rPr>
-        <w:t xml:space="preserve"> in </w:t>
-      </w:r>
-      <w:proofErr w:type="spellStart"/>
-      <w:r>
-        <w:rPr>
-          <w:lang w:val="en-US"/>
-        </w:rPr>
-        <w:t>turpis</w:t>
-      </w:r>
-      <w:proofErr w:type="spellEnd"/>
-      <w:r>
-        <w:rPr>
-          <w:lang w:val="en-US"/>
-        </w:rPr>
-        <w:t xml:space="preserve">. Proin et </w:t>
-      </w:r>
-      <w:proofErr w:type="spellStart"/>
-      <w:r>
-        <w:rPr>
-          <w:lang w:val="en-US"/>
-        </w:rPr>
-        <w:t>risus</w:t>
-      </w:r>
-      <w:proofErr w:type="spellEnd"/>
-      <w:r>
-        <w:rPr>
-          <w:lang w:val="en-US"/>
-        </w:rPr>
-        <w:t xml:space="preserve"> </w:t>
-      </w:r>
-      <w:proofErr w:type="spellStart"/>
-      <w:r>
-        <w:rPr>
-          <w:lang w:val="en-US"/>
-        </w:rPr>
-        <w:t>felis</w:t>
-      </w:r>
-      <w:proofErr w:type="spellEnd"/>
-      <w:r>
-        <w:rPr>
-          <w:lang w:val="en-US"/>
-        </w:rPr>
-        <w:t xml:space="preserve">. Duis sit </w:t>
-      </w:r>
-      <w:proofErr w:type="spellStart"/>
-      <w:r>
-        <w:rPr>
-          <w:lang w:val="en-US"/>
-        </w:rPr>
-        <w:t>amet</w:t>
-      </w:r>
-      <w:proofErr w:type="spellEnd"/>
-      <w:r>
-        <w:rPr>
-          <w:lang w:val="en-US"/>
-        </w:rPr>
-        <w:t xml:space="preserve"> </w:t>
-      </w:r>
-      <w:proofErr w:type="spellStart"/>
-      <w:r>
-        <w:rPr>
-          <w:lang w:val="en-US"/>
-        </w:rPr>
-        <w:t>efficitur</w:t>
-      </w:r>
-      <w:proofErr w:type="spellEnd"/>
-      <w:r>
-        <w:rPr>
-          <w:lang w:val="en-US"/>
-        </w:rPr>
-        <w:t xml:space="preserve"> lorem, sed auctor </w:t>
-      </w:r>
-      <w:proofErr w:type="spellStart"/>
-      <w:r>
-        <w:rPr>
-          <w:lang w:val="en-US"/>
-        </w:rPr>
-        <w:t>orci</w:t>
-      </w:r>
-      <w:proofErr w:type="spellEnd"/>
-    </w:p>
-    <w:p>
-      <w:pPr>
-        <w:pStyle w:val="Ttulo4"/>
-      </w:pPr>
-      <w:bookmarkStart w:id="5" w:name="_Toc240207450"/>
-      <w:r>
-        <w:t xml:space="preserve">2.2.1.1 Seção </w:t>
-      </w:r>
-      <w:proofErr w:type="spellStart"/>
-      <w:r>
-        <w:t>quartenária</w:t>
-      </w:r>
-      <w:bookmarkEnd w:id="5"/>
-      <w:proofErr w:type="spellEnd"/>
-    </w:p>
-    <w:p>
-      <w:proofErr w:type="spellStart"/>
-      <w:r>
-        <w:t>Pellentesque</w:t>
-      </w:r>
-      <w:proofErr w:type="spellEnd"/>
-      <w:r>
-        <w:t xml:space="preserve"> </w:t>
-      </w:r>
-      <w:proofErr w:type="spellStart"/>
-      <w:r>
-        <w:t>at</w:t>
-      </w:r>
-      <w:proofErr w:type="spellEnd"/>
-      <w:r>
-        <w:t xml:space="preserve"> est </w:t>
-      </w:r>
-      <w:proofErr w:type="spellStart"/>
-      <w:r>
-        <w:t>rutrum</w:t>
-      </w:r>
-      <w:proofErr w:type="spellEnd"/>
-      <w:r>
-        <w:t xml:space="preserve">, </w:t>
-      </w:r>
-      <w:proofErr w:type="spellStart"/>
-      <w:r>
-        <w:t>efficitur</w:t>
-      </w:r>
-      <w:proofErr w:type="spellEnd"/>
-      <w:r>
-        <w:t xml:space="preserve"> </w:t>
-      </w:r>
-      <w:proofErr w:type="spellStart"/>
-      <w:r>
-        <w:t>lacus</w:t>
-      </w:r>
-      <w:proofErr w:type="spellEnd"/>
-      <w:r>
-        <w:t xml:space="preserve"> ac, </w:t>
-      </w:r>
-      <w:proofErr w:type="spellStart"/>
-      <w:r>
-        <w:t>mollis</w:t>
-      </w:r>
-      <w:proofErr w:type="spellEnd"/>
-      <w:r>
-        <w:t xml:space="preserve"> </w:t>
-      </w:r>
-      <w:proofErr w:type="spellStart"/>
-      <w:r>
-        <w:t>sapien</w:t>
-      </w:r>
-      <w:proofErr w:type="spellEnd"/>
-      <w:r>
-        <w:t xml:space="preserve">. </w:t>
-      </w:r>
-      <w:proofErr w:type="spellStart"/>
-      <w:r>
-        <w:t>Aenean</w:t>
-      </w:r>
-      <w:proofErr w:type="spellEnd"/>
-      <w:r>
-        <w:t xml:space="preserve"> magna </w:t>
-      </w:r>
-      <w:proofErr w:type="spellStart"/>
-      <w:r>
-        <w:t>lorem</w:t>
-      </w:r>
-      <w:proofErr w:type="spellEnd"/>
-      <w:r>
-        <w:t xml:space="preserve">, </w:t>
-      </w:r>
-      <w:proofErr w:type="spellStart"/>
-      <w:r>
-        <w:t>mattis</w:t>
-      </w:r>
-      <w:proofErr w:type="spellEnd"/>
-      <w:r>
-        <w:t xml:space="preserve"> ac </w:t>
-      </w:r>
-      <w:proofErr w:type="spellStart"/>
-      <w:r>
-        <w:t>ligula</w:t>
-      </w:r>
-      <w:proofErr w:type="spellEnd"/>
-      <w:r>
-        <w:t xml:space="preserve"> et, </w:t>
-      </w:r>
-      <w:proofErr w:type="spellStart"/>
-      <w:r>
-        <w:t>auctor</w:t>
-      </w:r>
-      <w:proofErr w:type="spellEnd"/>
-      <w:r>
-        <w:t xml:space="preserve"> </w:t>
-      </w:r>
-      <w:proofErr w:type="spellStart"/>
-      <w:r>
-        <w:t>luctus</w:t>
-      </w:r>
-      <w:proofErr w:type="spellEnd"/>
-      <w:r>
-        <w:t xml:space="preserve"> ex. </w:t>
-      </w:r>
-    </w:p>
-    <w:p>
-      <w:pPr>
-        <w:pStyle w:val="Ttulo5"/>
-      </w:pPr>
-      <w:bookmarkStart w:id="6" w:name="_Toc240207451"/>
-      <w:r>
-        <w:t>2.2.1.1.1 Seção quinária</w:t>
-      </w:r>
-      <w:bookmarkEnd w:id="6"/>
-    </w:p>
-    <w:p>
-      <w:r>
-        <w:tab/>
-      </w:r>
-      <w:proofErr w:type="spellStart"/>
-      <w:r>
-        <w:t>Vivamus</w:t>
-      </w:r>
-      <w:proofErr w:type="spellEnd"/>
-      <w:r>
-        <w:t xml:space="preserve"> vitae </w:t>
-      </w:r>
-      <w:proofErr w:type="spellStart"/>
-      <w:r>
-        <w:t>posuere</w:t>
-      </w:r>
-      <w:proofErr w:type="spellEnd"/>
-      <w:r>
-        <w:t xml:space="preserve"> </w:t>
-      </w:r>
-      <w:proofErr w:type="spellStart"/>
-      <w:r>
-        <w:t>nisl</w:t>
-      </w:r>
-      <w:proofErr w:type="spellEnd"/>
-      <w:r>
-        <w:t xml:space="preserve">, eu </w:t>
-      </w:r>
-      <w:proofErr w:type="spellStart"/>
-      <w:r>
-        <w:t>scelerisque</w:t>
-      </w:r>
-      <w:proofErr w:type="spellEnd"/>
-      <w:r>
-        <w:t xml:space="preserve"> </w:t>
-      </w:r>
-      <w:proofErr w:type="spellStart"/>
-      <w:r>
-        <w:t>dolor</w:t>
-      </w:r>
-      <w:proofErr w:type="spellEnd"/>
-      <w:r>
-        <w:t xml:space="preserve">. </w:t>
-      </w:r>
-      <w:r>
-        <w:rPr>
-          <w:lang w:val="en-US"/>
-        </w:rPr>
-        <w:t xml:space="preserve">Proin </w:t>
-      </w:r>
-      <w:proofErr w:type="spellStart"/>
-      <w:r>
-        <w:rPr>
-          <w:lang w:val="en-US"/>
-        </w:rPr>
-        <w:t>aliquam</w:t>
-      </w:r>
-      <w:proofErr w:type="spellEnd"/>
-      <w:r>
-        <w:rPr>
-          <w:lang w:val="en-US"/>
-        </w:rPr>
-        <w:t xml:space="preserve"> </w:t>
-      </w:r>
-      <w:proofErr w:type="spellStart"/>
-      <w:r>
-        <w:rPr>
-          <w:lang w:val="en-US"/>
-        </w:rPr>
-        <w:t>sollicitudin</w:t>
-      </w:r>
-      <w:proofErr w:type="spellEnd"/>
-      <w:r>
-        <w:rPr>
-          <w:lang w:val="en-US"/>
-        </w:rPr>
-        <w:t xml:space="preserve"> </w:t>
-      </w:r>
-      <w:proofErr w:type="spellStart"/>
-      <w:r>
-        <w:rPr>
-          <w:lang w:val="en-US"/>
-        </w:rPr>
-        <w:t>elit</w:t>
-      </w:r>
-      <w:proofErr w:type="spellEnd"/>
-      <w:r>
-        <w:rPr>
-          <w:lang w:val="en-US"/>
-        </w:rPr>
-        <w:t xml:space="preserve"> nec </w:t>
-      </w:r>
-      <w:proofErr w:type="spellStart"/>
-      <w:r>
-        <w:rPr>
-          <w:lang w:val="en-US"/>
-        </w:rPr>
-        <w:t>laoreet</w:t>
-      </w:r>
-      <w:proofErr w:type="spellEnd"/>
-      <w:r>
-        <w:rPr>
-          <w:lang w:val="en-US"/>
-        </w:rPr>
-        <w:t xml:space="preserve">. </w:t>
-      </w:r>
-      <w:proofErr w:type="spellStart"/>
-      <w:r>
-        <w:t>Nulla</w:t>
-      </w:r>
-      <w:proofErr w:type="spellEnd"/>
-      <w:r>
-        <w:t xml:space="preserve"> </w:t>
-      </w:r>
-      <w:proofErr w:type="spellStart"/>
-      <w:r>
-        <w:t>eget</w:t>
-      </w:r>
-      <w:proofErr w:type="spellEnd"/>
-      <w:r>
-        <w:t xml:space="preserve"> </w:t>
-      </w:r>
-      <w:proofErr w:type="spellStart"/>
-      <w:r>
-        <w:t>tincidunt</w:t>
-      </w:r>
-      <w:proofErr w:type="spellEnd"/>
-      <w:r>
-        <w:t xml:space="preserve"> </w:t>
-      </w:r>
-      <w:proofErr w:type="spellStart"/>
-      <w:r>
-        <w:t>eros</w:t>
-      </w:r>
-      <w:proofErr w:type="spellEnd"/>
-      <w:r>
-        <w:t xml:space="preserve">, </w:t>
-      </w:r>
-      <w:proofErr w:type="spellStart"/>
-      <w:r>
-        <w:t>eget</w:t>
-      </w:r>
-      <w:proofErr w:type="spellEnd"/>
-      <w:r>
-        <w:t xml:space="preserve"> </w:t>
-      </w:r>
-      <w:proofErr w:type="spellStart"/>
-      <w:r>
-        <w:t>efficitur</w:t>
-      </w:r>
-      <w:proofErr w:type="spellEnd"/>
-      <w:r>
-        <w:t xml:space="preserve"> </w:t>
-      </w:r>
-      <w:proofErr w:type="spellStart"/>
-      <w:r>
-        <w:t>tortor</w:t>
-      </w:r>
-      <w:proofErr w:type="spellEnd"/>
-      <w:r>
-        <w:t xml:space="preserve">. In </w:t>
-      </w:r>
-      <w:proofErr w:type="spellStart"/>
-      <w:r>
-        <w:t>ultricies</w:t>
-      </w:r>
-      <w:proofErr w:type="spellEnd"/>
-      <w:r>
-        <w:t xml:space="preserve"> </w:t>
-      </w:r>
-      <w:proofErr w:type="spellStart"/>
-      <w:r>
-        <w:t>eleifend</w:t>
-      </w:r>
-      <w:proofErr w:type="spellEnd"/>
-      <w:r>
-        <w:t xml:space="preserve"> </w:t>
-      </w:r>
-      <w:proofErr w:type="gramStart"/>
-      <w:r>
-        <w:t xml:space="preserve">ante, </w:t>
-      </w:r>
-      <w:proofErr w:type="spellStart"/>
-      <w:r>
-        <w:t>nec</w:t>
-      </w:r>
-      <w:proofErr w:type="spellEnd"/>
-      <w:proofErr w:type="gramEnd"/>
-      <w:r>
-        <w:t xml:space="preserve"> </w:t>
-      </w:r>
-      <w:proofErr w:type="spellStart"/>
-      <w:r>
-        <w:t>fringilla</w:t>
-      </w:r>
-      <w:proofErr w:type="spellEnd"/>
-      <w:r>
-        <w:t xml:space="preserve"> libero </w:t>
-      </w:r>
-      <w:proofErr w:type="spellStart"/>
-      <w:r>
-        <w:t>rutrum</w:t>
-      </w:r>
-      <w:proofErr w:type="spellEnd"/>
-      <w:r>
-        <w:t xml:space="preserve"> vitae.</w:t>
-      </w:r>
-    </w:p>
-    <w:p>
-      <w:pPr>
-        <w:pStyle w:val="Ttulo1"/>
-      </w:pPr>
-      <w:bookmarkStart w:id="7" w:name="_Toc240207452"/>
-      <w:r>
         <w:t xml:space="preserve">3. </w:t>
       </w:r>
       <w:r>
@@ -1828,6 +1862,14 @@
       <w:bookmarkEnd w:id="7"/>
     </w:p>
     <w:p>
+      <w:pPr>
+        <w:sectPr>
+          <w:pgSz w:w="11906" w:h="16838"/>
+          <w:pgMar w:top="1701" w:right="1134" w:bottom="1134" w:left="1701" w:header="708" w:footer="708" w:gutter="0"/>
+          <w:cols w:space="708"/>
+          <w:docGrid w:linePitch="360"/>
+        </w:sectPr>
+      </w:pPr>
       <w:r>
         <w:t>É onde o aluno finaliza o trabalho, escrevendo seu ponto de vista sobre o assunto e as conclusões que tirou com a pesquisa realizada.</w:t>
       </w:r>
@@ -1842,6 +1884,7 @@
         <w:jc w:val="left"/>
       </w:pPr>
       <w:r>
+        <w:lastRenderedPageBreak/>
         <w:tab/>
       </w:r>
       <w:bookmarkStart w:id="8" w:name="_Toc240207453"/>
@@ -1949,6 +1992,48 @@
     </w:p>
   </w:footnote>
 </w:footnotes>
+</file>
+
+<file path=word/header1.xml><?xml version="1.0" encoding="utf-8"?>
+<w:hdr xmlns:wpc="http://schemas.microsoft.com/office/word/2010/wordprocessingCanvas" xmlns:cx="http://schemas.microsoft.com/office/drawing/2014/chartex" xmlns:cx1="http://schemas.microsoft.com/office/drawing/2015/9/8/chartex" xmlns:cx2="http://schemas.microsoft.com/office/drawing/2015/10/21/chartex" xmlns:cx3="http://schemas.microsoft.com/office/drawing/2016/5/9/chartex" xmlns:cx4="http://schemas.microsoft.com/office/drawing/2016/5/10/chartex" xmlns:cx5="http://schemas.microsoft.com/office/drawing/2016/5/11/chartex" xmlns:cx6="http://schemas.microsoft.com/office/drawing/2016/5/12/chartex" xmlns:cx7="http://schemas.microsoft.com/office/drawing/2016/5/13/chartex" xmlns:cx8="http://schemas.microsoft.com/office/drawing/2016/5/14/chartex" xmlns:mc="http://schemas.openxmlformats.org/markup-compatibility/2006" xmlns:aink="http://schemas.microsoft.com/office/drawing/2016/ink" xmlns:am3d="http://schemas.microsoft.com/office/drawing/2017/model3d" xmlns:o="urn:schemas-microsoft-com:office:office" xmlns:oel="http://schemas.microsoft.com/office/2019/extlst" xmlns:r="http://schemas.openxmlformats.org/officeDocument/2006/relationships" xmlns:m="http://schemas.openxmlformats.org/officeDocument/2006/math" xmlns:v="urn:schemas-microsoft-com:vml" xmlns:wp14="http://schemas.microsoft.com/office/word/2010/wordprocessingDrawing" xmlns:wp="http://schemas.openxmlformats.org/drawingml/2006/wordprocessingDrawing" xmlns:w10="urn:schemas-microsoft-com:office:word" xmlns:w="http://schemas.openxmlformats.org/wordprocessingml/2006/main" xmlns:w14="http://schemas.microsoft.com/office/word/2010/wordml" xmlns:w15="http://schemas.microsoft.com/office/word/2012/wordml" xmlns:w16cex="http://schemas.microsoft.com/office/word/2018/wordml/cex" xmlns:w16cid="http://schemas.microsoft.com/office/word/2016/wordml/cid" xmlns:w16="http://schemas.microsoft.com/office/word/2018/wordml" xmlns:w16du="http://schemas.microsoft.com/office/word/2023/wordml/word16du" xmlns:w16sdtdh="http://schemas.microsoft.com/office/word/2020/wordml/sdtdatahash" xmlns:w16sdtfl="http://schemas.microsoft.com/office/word/2024/wordml/sdtformatlock" xmlns:w16se="http://schemas.microsoft.com/office/word/2015/wordml/symex" xmlns:wpg="http://schemas.microsoft.com/office/word/2010/wordprocessingGroup" xmlns:wpi="http://schemas.microsoft.com/office/word/2010/wordprocessingInk" xmlns:wne="http://schemas.microsoft.com/office/word/2006/wordml" xmlns:wps="http://schemas.microsoft.com/office/word/2010/wordprocessingShape" mc:Ignorable="w14 w15 w16se w16cid w16 w16cex w16sdtdh w16sdtfl w16du wp14">
+  <w:sdt>
+    <w:sdtPr>
+      <w:id w:val="1535614561"/>
+      <w:docPartObj>
+        <w:docPartGallery w:val="Page Numbers (Top of Page)"/>
+        <w:docPartUnique/>
+      </w:docPartObj>
+    </w:sdtPr>
+    <w:sdtContent>
+      <w:p>
+        <w:pPr>
+          <w:pStyle w:val="Cabealho"/>
+          <w:jc w:val="right"/>
+        </w:pPr>
+        <w:r>
+          <w:fldChar w:fldCharType="begin"/>
+        </w:r>
+        <w:r>
+          <w:instrText>PAGE   \* MERGEFORMAT</w:instrText>
+        </w:r>
+        <w:r>
+          <w:fldChar w:fldCharType="separate"/>
+        </w:r>
+        <w:r>
+          <w:t>2</w:t>
+        </w:r>
+        <w:r>
+          <w:fldChar w:fldCharType="end"/>
+        </w:r>
+      </w:p>
+    </w:sdtContent>
+  </w:sdt>
+  <w:p>
+    <w:pPr>
+      <w:pStyle w:val="Cabealho"/>
+    </w:pPr>
+  </w:p>
+</w:hdr>
 </file>
 
 <file path=word/styles.xml><?xml version="1.0" encoding="utf-8"?>
@@ -3335,7 +3420,7 @@
 </file>
 
 <file path=customXml/itemProps1.xml><?xml version="1.0" encoding="utf-8"?>
-<ds:datastoreItem xmlns:ds="http://schemas.openxmlformats.org/officeDocument/2006/customXml" ds:itemID="{FF122291-4B3E-44AB-AC1A-0595511206F2}">
+<ds:datastoreItem xmlns:ds="http://schemas.openxmlformats.org/officeDocument/2006/customXml" ds:itemID="{BAC5C271-CFFB-4BD5-B754-FE1A59FFC743}">
   <ds:schemaRefs>
     <ds:schemaRef ds:uri="http://schemas.openxmlformats.org/officeDocument/2006/bibliography"/>
   </ds:schemaRefs>

</xml_diff>

<commit_message>
concertar erro na capa
</commit_message>
<xml_diff>
--- a/TemplateFund2Word.docx
+++ b/TemplateFund2Word.docx
@@ -4,6 +4,7 @@
   <w:body>
     <w:p>
       <w:pPr>
+        <w:ind w:firstLine="0"/>
         <w:jc w:val="center"/>
         <w:rPr>
           <w:b/>
@@ -20,6 +21,7 @@
     </w:p>
     <w:p>
       <w:pPr>
+        <w:ind w:firstLine="0"/>
         <w:jc w:val="center"/>
         <w:rPr>
           <w:b/>
@@ -36,21 +38,25 @@
     </w:p>
     <w:p>
       <w:pPr>
+        <w:ind w:firstLine="0"/>
         <w:jc w:val="center"/>
       </w:pPr>
     </w:p>
     <w:p>
       <w:pPr>
+        <w:ind w:firstLine="0"/>
         <w:jc w:val="center"/>
       </w:pPr>
     </w:p>
     <w:p>
       <w:pPr>
+        <w:ind w:firstLine="0"/>
         <w:jc w:val="center"/>
       </w:pPr>
     </w:p>
     <w:p>
       <w:pPr>
+        <w:ind w:firstLine="0"/>
         <w:jc w:val="center"/>
         <w:rPr>
           <w:u w:val="single"/>
@@ -62,6 +68,7 @@
     </w:p>
     <w:p>
       <w:pPr>
+        <w:ind w:firstLine="0"/>
         <w:jc w:val="center"/>
       </w:pPr>
       <w:r>
@@ -70,6 +77,7 @@
     </w:p>
     <w:p>
       <w:pPr>
+        <w:ind w:firstLine="0"/>
         <w:jc w:val="center"/>
       </w:pPr>
       <w:r>
@@ -78,46 +86,58 @@
     </w:p>
     <w:p>
       <w:pPr>
+        <w:ind w:firstLine="0"/>
         <w:jc w:val="center"/>
       </w:pPr>
     </w:p>
     <w:p>
       <w:pPr>
+        <w:ind w:firstLine="0"/>
         <w:jc w:val="center"/>
       </w:pPr>
     </w:p>
     <w:p>
       <w:pPr>
+        <w:ind w:firstLine="0"/>
         <w:jc w:val="center"/>
       </w:pPr>
     </w:p>
     <w:p>
       <w:pPr>
+        <w:ind w:firstLine="0"/>
         <w:jc w:val="center"/>
       </w:pPr>
     </w:p>
     <w:p>
       <w:pPr>
+        <w:ind w:firstLine="0"/>
         <w:jc w:val="center"/>
-      </w:pPr>
-    </w:p>
-    <w:p>
-      <w:pPr>
+        <w:rPr>
+          <w:u w:val="single"/>
+        </w:rPr>
+      </w:pPr>
+    </w:p>
+    <w:p>
+      <w:pPr>
+        <w:ind w:firstLine="0"/>
         <w:jc w:val="center"/>
       </w:pPr>
     </w:p>
     <w:p>
       <w:pPr>
+        <w:ind w:firstLine="0"/>
         <w:jc w:val="center"/>
       </w:pPr>
     </w:p>
     <w:p>
       <w:pPr>
+        <w:ind w:firstLine="0"/>
         <w:jc w:val="center"/>
       </w:pPr>
     </w:p>
     <w:p>
       <w:pPr>
+        <w:ind w:firstLine="0"/>
         <w:jc w:val="center"/>
         <w:rPr>
           <w:b/>
@@ -134,6 +154,7 @@
     </w:p>
     <w:p>
       <w:pPr>
+        <w:ind w:firstLine="0"/>
         <w:jc w:val="center"/>
       </w:pPr>
       <w:r>
@@ -142,76 +163,91 @@
     </w:p>
     <w:p>
       <w:pPr>
+        <w:ind w:firstLine="0"/>
         <w:jc w:val="center"/>
       </w:pPr>
     </w:p>
     <w:p>
       <w:pPr>
+        <w:ind w:firstLine="0"/>
         <w:jc w:val="center"/>
       </w:pPr>
     </w:p>
     <w:p>
       <w:pPr>
+        <w:ind w:firstLine="0"/>
         <w:jc w:val="center"/>
       </w:pPr>
     </w:p>
     <w:p>
       <w:pPr>
+        <w:ind w:firstLine="0"/>
         <w:jc w:val="center"/>
       </w:pPr>
     </w:p>
     <w:p>
       <w:pPr>
+        <w:ind w:firstLine="0"/>
         <w:jc w:val="center"/>
       </w:pPr>
     </w:p>
     <w:p>
       <w:pPr>
+        <w:ind w:firstLine="0"/>
         <w:jc w:val="center"/>
       </w:pPr>
     </w:p>
     <w:p>
       <w:pPr>
+        <w:ind w:firstLine="0"/>
         <w:jc w:val="center"/>
       </w:pPr>
     </w:p>
     <w:p>
       <w:pPr>
+        <w:ind w:firstLine="0"/>
         <w:jc w:val="center"/>
       </w:pPr>
     </w:p>
     <w:p>
       <w:pPr>
+        <w:ind w:firstLine="0"/>
         <w:jc w:val="center"/>
       </w:pPr>
     </w:p>
     <w:p>
       <w:pPr>
+        <w:ind w:firstLine="0"/>
         <w:jc w:val="center"/>
       </w:pPr>
     </w:p>
     <w:p>
       <w:pPr>
+        <w:ind w:firstLine="0"/>
         <w:jc w:val="center"/>
       </w:pPr>
     </w:p>
     <w:p>
       <w:pPr>
+        <w:ind w:firstLine="0"/>
         <w:jc w:val="center"/>
       </w:pPr>
     </w:p>
     <w:p>
       <w:pPr>
+        <w:ind w:firstLine="0"/>
         <w:jc w:val="center"/>
       </w:pPr>
     </w:p>
     <w:p>
       <w:pPr>
+        <w:ind w:firstLine="0"/>
         <w:jc w:val="center"/>
       </w:pPr>
     </w:p>
     <w:p>
       <w:pPr>
+        <w:ind w:firstLine="0"/>
         <w:jc w:val="center"/>
       </w:pPr>
       <w:r>
@@ -220,7 +256,7 @@
     </w:p>
     <w:p>
       <w:pPr>
-        <w:ind w:firstLine="708"/>
+        <w:ind w:firstLine="0"/>
         <w:jc w:val="center"/>
       </w:pPr>
       <w:r>
@@ -938,7 +974,6 @@
           <w:type w:val="continuous"/>
           <w:pgSz w:w="11906" w:h="16838"/>
           <w:pgMar w:top="1701" w:right="1134" w:bottom="1134" w:left="1701" w:header="708" w:footer="708" w:gutter="0"/>
-          <w:lnNumType w:countBy="1" w:restart="continuous"/>
           <w:cols w:space="708"/>
           <w:docGrid w:linePitch="360"/>
         </w:sectPr>

</xml_diff>